<commit_message>
updated the visuals in the porfolio
</commit_message>
<xml_diff>
--- a/CV/CV Maikel Boezer.docx
+++ b/CV/CV Maikel Boezer.docx
@@ -3425,6 +3425,7 @@
                 <w:lang w:val="en-US"/>
               </w:rPr>
             </w:pPr>
+            <w:proofErr w:type="spellStart"/>
             <w:r>
               <w:rPr>
                 <w:rFonts w:ascii="Arial" w:hAnsi="Arial"/>
@@ -3441,8 +3442,29 @@
                 <w:sz w:val="20"/>
                 <w:lang w:val="en-US"/>
               </w:rPr>
-              <w:t>Smart/BUas</w:t>
-            </w:r>
+              <w:t>Smart</w:t>
+            </w:r>
+            <w:proofErr w:type="spellEnd"/>
+            <w:r>
+              <w:rPr>
+                <w:rFonts w:ascii="Arial" w:hAnsi="Arial"/>
+                <w:bCs/>
+                <w:sz w:val="20"/>
+                <w:lang w:val="en-US"/>
+              </w:rPr>
+              <w:t>/</w:t>
+            </w:r>
+            <w:proofErr w:type="spellStart"/>
+            <w:r>
+              <w:rPr>
+                <w:rFonts w:ascii="Arial" w:hAnsi="Arial"/>
+                <w:bCs/>
+                <w:sz w:val="20"/>
+                <w:lang w:val="en-US"/>
+              </w:rPr>
+              <w:t>BUas</w:t>
+            </w:r>
+            <w:proofErr w:type="spellEnd"/>
           </w:p>
           <w:p>
             <w:pPr>
@@ -3993,16 +4015,14 @@
                 <w:lang w:val="nl-NL"/>
               </w:rPr>
             </w:pPr>
-            <w:proofErr w:type="gramStart"/>
-            <w:r>
-              <w:rPr>
-                <w:rFonts w:ascii="Arial" w:hAnsi="Arial"/>
-                <w:sz w:val="20"/>
-                <w:lang w:val="nl-NL"/>
-              </w:rPr>
-              <w:t>Snuffel stage</w:t>
-            </w:r>
-            <w:proofErr w:type="gramEnd"/>
+            <w:r>
+              <w:rPr>
+                <w:rFonts w:ascii="Arial" w:hAnsi="Arial"/>
+                <w:sz w:val="20"/>
+                <w:lang w:val="nl-NL"/>
+              </w:rPr>
+              <w:t>Snuffelstage</w:t>
+            </w:r>
             <w:r>
               <w:rPr>
                 <w:rFonts w:ascii="Arial" w:hAnsi="Arial"/>
@@ -4982,65 +5002,15 @@
     </w:p>
     <w:p>
       <w:pPr>
-        <w:pStyle w:val="NormalWeb"/>
-      </w:pPr>
-      <w:r>
-        <w:t>Formalising deployment for the Breda Guardians Esports Analytics Toolkit, my graduation thesis project at The Hive, Breda University of Applied Sciences (BUas). The Play-Smart toolkit, an earlier prototype built by students, captured player performance data through eye tracking, facial emotion recognition, and keyboard/mouse input, feeding into a dashboard for esports coaching. The problem this project addressed was that deployment of the toolkit was still entirely manual: files were carried between machines by USB, paths were hard-coded, and the environment had to be reconstructed by hand on every new PC, which had become slow, fragile, and increasingly unworkable as more contributors and institutions (Tilburg University and the University of Twente) joined the project.</w:t>
-      </w:r>
-    </w:p>
-    <w:p>
-      <w:pPr>
-        <w:pStyle w:val="NormalWeb"/>
-      </w:pPr>
-      <w:r>
-        <w:t>Because of this, the project came down to migrating the toolkit from that manual, USB-based process to a consolidated, version-controlled workflow built around GitHub, and evaluating whether that migration actually improved things, both in deployment speed and in the experience of the people doing the deployments.</w:t>
-      </w:r>
-    </w:p>
-    <w:p>
-      <w:pPr>
-        <w:pStyle w:val="NormalWeb"/>
-      </w:pPr>
-      <w:r>
-        <w:t>I started by designing a branching strategy that could handle two problems at once: letting partner institutions work independently while BUas kept control over what got merged back, and giving student contributors enough structure to avoid mistakes without killing their ability to experiment. I solved this with a hybrid approach, a forking model between institutions combined with a Git-Flow-style main branch and GitHub-Flow-style feature branches within each institutional fork. I also built an automated deployment pipeline using GitHub Actions that detects which service changed (backend, frontend, pipeline, or inference container) and rebuilds and redeploys only that one, reducing both manual effort and the chance of human error.</w:t>
-      </w:r>
-    </w:p>
-    <w:p>
-      <w:pPr>
-        <w:pStyle w:val="NormalWeb"/>
-      </w:pPr>
-      <w:r>
-        <w:t>To evaluate whether this new workflow was actually better, not just faster on paper, I ran a within-subjects usability study with four experienced project contributors, each of whom deployed the toolkit using both the old manual method and the new GitHub-based method, while I measured deployment time and collected their experience through a questionnaire built on the Technology Acceptance Model and the DORA and SPACE frameworks.</w:t>
-      </w:r>
-    </w:p>
-    <w:p>
-      <w:pPr>
-        <w:pStyle w:val="NormalWeb"/>
-      </w:pPr>
-      <w:r>
-        <w:t>The results were consistent across all four participants: the GitHub-based method was faster for everyone, taking roughly 8 to 12 minutes compared to 22 to 33 minutes manually, with most of the manual time lost to USB transfer problems rather than the actual toolkit setup. It was also rated easier to use, less mentally demanding, more reliable, and more likely to be reused by every single participant. The automated pipeline itself also behaved as intended in production, correctly rebuilding and redeploying only the changed containers on real merges.</w:t>
-      </w:r>
-    </w:p>
-    <w:p>
-      <w:pPr>
-        <w:pStyle w:val="NormalWeb"/>
-      </w:pPr>
-      <w:r>
-        <w:lastRenderedPageBreak/>
-        <w:t>In conclusion, the study supported adopting the new version-controlled workflow as the standard way of deploying the toolkit going forward, and I documented the remaining limitations (small sample size, only tested with experienced users, some inconsistency in dependency distribution) as directions for future work.</w:t>
-      </w:r>
-    </w:p>
-    <w:p>
-      <w:pPr>
         <w:rPr>
           <w:rFonts w:ascii="Arial" w:hAnsi="Arial"/>
           <w:b/>
-          <w:sz w:val="32"/>
-          <w:szCs w:val="32"/>
-        </w:rPr>
-      </w:pPr>
-    </w:p>
-    <w:p>
-      <w:pPr>
+          <w:sz w:val="24"/>
+          <w:szCs w:val="24"/>
+          <w:lang w:val="en-GB"/>
+        </w:rPr>
+      </w:pPr>
+      <w:r>
         <w:rPr>
           <w:rFonts w:ascii="Arial" w:hAnsi="Arial"/>
           <w:b/>
@@ -5048,762 +5018,25 @@
           <w:szCs w:val="24"/>
           <w:lang w:val="en-GB"/>
         </w:rPr>
-      </w:pPr>
+        <w:t xml:space="preserve">More details about all the projects can be found on my portfolio </w:t>
+      </w:r>
+      <w:hyperlink r:id="rId9" w:history="1">
+        <w:r>
+          <w:rPr>
+            <w:rStyle w:val="Hyperlink"/>
+            <w:rFonts w:ascii="Arial" w:hAnsi="Arial"/>
+            <w:b/>
+            <w:sz w:val="24"/>
+            <w:szCs w:val="24"/>
+            <w:lang w:val="en-GB"/>
+          </w:rPr>
+          <w:t>website</w:t>
+        </w:r>
+      </w:hyperlink>
       <w:r>
         <w:rPr>
           <w:rFonts w:ascii="Arial" w:hAnsi="Arial"/>
           <w:b/>
-          <w:sz w:val="24"/>
-          <w:szCs w:val="24"/>
-          <w:lang w:val="en-GB"/>
-        </w:rPr>
-        <w:t>Dashboard pipeline:</w:t>
-      </w:r>
-    </w:p>
-    <w:p>
-      <w:pPr>
-        <w:pStyle w:val="NormalWeb"/>
-      </w:pPr>
-      <w:r>
-        <w:t>Making a Power BI dashboard for Stedin, an electricity and gas company in the Netherlands, to monitor the quality of the green gas fed into their network from 12 locations across the country. This project was for Stedin's green gas department, who previously only received quality reports every 6 months from a third party and had no easy way to check the gas quality themselves without manually downloading and processing data per location, a process that took 15 to 30 minutes each time. Because of this, the project came down to building a dashboard that tracks all the relevant gas values, Oxygen, Carbon dioxide, water dew point, pressure, Hydrogen sulphide, and Wobbe index, and automating the process of getting that data onto it.</w:t>
-      </w:r>
-    </w:p>
-    <w:p>
-      <w:pPr>
-        <w:pStyle w:val="NormalWeb"/>
-      </w:pPr>
-      <w:r>
-        <w:t>We started with data collection, which comes from a third-party company called TeleControlNet (TCN) that compiles data from all the feeder locations. Since TCN's API didn't allow downloading data in the format needed, I used robotic process automation (RPA) in Python to mimic the actions of a user downloading the data manually from the website.</w:t>
-      </w:r>
-    </w:p>
-    <w:p>
-      <w:pPr>
-        <w:pStyle w:val="NormalWeb"/>
-      </w:pPr>
-      <w:r>
-        <w:t>After downloading, the data needed to be cleaned and filtered before it could be used, since the amount and quality of data varied a lot between locations. During this process I found a few anomalies: one location measured pressure differently than the others (not a real problem, just an inconsistency in units), and three other locations had a large percentage of missing data in one column because a provider had set up recording differently than the rest of the system, which meant that column had to be dropped for those locations to keep the rest of the data usable.</w:t>
-      </w:r>
-    </w:p>
-    <w:p>
-      <w:pPr>
-        <w:pStyle w:val="NormalWeb"/>
-      </w:pPr>
-      <w:r>
-        <w:t>The last part of the project was to automate the whole pipeline and finish the dashboard. I built an executable application that runs the RPA download, moves and renames the data, cleans and filters it, and saves it to an export folder connected to a SharePoint location that feeds directly into the Power BI dashboard. This meant my supervisors could refresh the dashboard themselves without needing to touch the underlying code. I also built a custom Wobbe index visual in Power BI using a Python visual, translating an existing Excel-based calculation into Python logic, since there was no standard way to replicate it in Power BI.</w:t>
-      </w:r>
-    </w:p>
-    <w:p>
-      <w:pPr>
-        <w:rPr>
-          <w:rFonts w:ascii="Arial" w:hAnsi="Arial"/>
-          <w:b/>
-          <w:sz w:val="32"/>
-          <w:szCs w:val="32"/>
-        </w:rPr>
-      </w:pPr>
-    </w:p>
-    <w:p>
-      <w:pPr>
-        <w:rPr>
-          <w:rFonts w:ascii="Arial" w:hAnsi="Arial"/>
-          <w:b/>
-          <w:sz w:val="32"/>
-          <w:szCs w:val="32"/>
-        </w:rPr>
-      </w:pPr>
-    </w:p>
-    <w:p>
-      <w:pPr>
-        <w:rPr>
-          <w:rFonts w:ascii="Arial" w:hAnsi="Arial"/>
-          <w:b/>
-          <w:sz w:val="32"/>
-          <w:szCs w:val="32"/>
-        </w:rPr>
-      </w:pPr>
-    </w:p>
-    <w:p>
-      <w:pPr>
-        <w:rPr>
-          <w:rFonts w:ascii="Arial" w:hAnsi="Arial"/>
-          <w:b/>
-          <w:sz w:val="24"/>
-          <w:szCs w:val="24"/>
-          <w:lang w:val="en-GB"/>
-        </w:rPr>
-      </w:pPr>
-      <w:r>
-        <w:rPr>
-          <w:rFonts w:ascii="Arial" w:hAnsi="Arial"/>
-          <w:b/>
-          <w:sz w:val="24"/>
-          <w:szCs w:val="24"/>
-          <w:lang w:val="en-GB"/>
-        </w:rPr>
-        <w:t>AI coach:</w:t>
-      </w:r>
-    </w:p>
-    <w:p>
-      <w:pPr>
-        <w:tabs>
-          <w:tab w:val="center" w:pos="4513"/>
-        </w:tabs>
-        <w:rPr>
-          <w:rFonts w:ascii="Arial" w:hAnsi="Arial" w:cs="Arial"/>
-          <w:sz w:val="24"/>
-          <w:szCs w:val="24"/>
-          <w:lang w:val="en-GB"/>
-        </w:rPr>
-      </w:pPr>
-      <w:r>
-        <w:rPr>
-          <w:rFonts w:ascii="Arial" w:hAnsi="Arial" w:cs="Arial"/>
-          <w:sz w:val="24"/>
-          <w:szCs w:val="24"/>
-          <w:lang w:val="en-GB"/>
-        </w:rPr>
-        <w:t>M</w:t>
-      </w:r>
-      <w:r>
-        <w:rPr>
-          <w:rFonts w:ascii="Arial" w:hAnsi="Arial" w:cs="Arial"/>
-          <w:sz w:val="24"/>
-          <w:szCs w:val="24"/>
-          <w:lang w:val="en-GB"/>
-        </w:rPr>
-        <w:t xml:space="preserve">aking an AI coach for an E-sports </w:t>
-      </w:r>
-      <w:r>
-        <w:rPr>
-          <w:rFonts w:ascii="Arial" w:hAnsi="Arial" w:cs="Arial"/>
-          <w:sz w:val="24"/>
-          <w:szCs w:val="24"/>
-          <w:lang w:val="en-GB"/>
-        </w:rPr>
-        <w:t>organisation</w:t>
-      </w:r>
-      <w:r>
-        <w:rPr>
-          <w:rFonts w:ascii="Arial" w:hAnsi="Arial" w:cs="Arial"/>
-          <w:sz w:val="24"/>
-          <w:szCs w:val="24"/>
-          <w:lang w:val="en-GB"/>
-        </w:rPr>
-        <w:t xml:space="preserve"> named Breda Guardians </w:t>
-      </w:r>
-      <w:r>
-        <w:rPr>
-          <w:rFonts w:ascii="Arial" w:hAnsi="Arial" w:cs="Arial"/>
-          <w:sz w:val="24"/>
-          <w:szCs w:val="24"/>
-          <w:lang w:val="en-GB"/>
-        </w:rPr>
-        <w:t>which</w:t>
-      </w:r>
-      <w:r>
-        <w:rPr>
-          <w:rFonts w:ascii="Arial" w:hAnsi="Arial" w:cs="Arial"/>
-          <w:sz w:val="24"/>
-          <w:szCs w:val="24"/>
-          <w:lang w:val="en-GB"/>
-        </w:rPr>
-        <w:t xml:space="preserve"> is based in </w:t>
-      </w:r>
-      <w:r>
-        <w:rPr>
-          <w:rFonts w:ascii="Arial" w:hAnsi="Arial" w:cs="Arial"/>
-          <w:sz w:val="24"/>
-          <w:szCs w:val="24"/>
-          <w:lang w:val="en-GB"/>
-        </w:rPr>
-        <w:t>the HIVE at Brade University of applied sciences (</w:t>
-      </w:r>
-      <w:proofErr w:type="spellStart"/>
-      <w:r>
-        <w:rPr>
-          <w:rFonts w:ascii="Arial" w:hAnsi="Arial" w:cs="Arial"/>
-          <w:sz w:val="24"/>
-          <w:szCs w:val="24"/>
-          <w:lang w:val="en-GB"/>
-        </w:rPr>
-        <w:t>BUas</w:t>
-      </w:r>
-      <w:proofErr w:type="spellEnd"/>
-      <w:r>
-        <w:rPr>
-          <w:rFonts w:ascii="Arial" w:hAnsi="Arial" w:cs="Arial"/>
-          <w:sz w:val="24"/>
-          <w:szCs w:val="24"/>
-          <w:lang w:val="en-GB"/>
-        </w:rPr>
-        <w:t xml:space="preserve">). This project is a multi-year project for students of the applied data science and AI (ADS&amp;AI) course, I was part of the first group to work on this </w:t>
-      </w:r>
-      <w:proofErr w:type="gramStart"/>
-      <w:r>
-        <w:rPr>
-          <w:rFonts w:ascii="Arial" w:hAnsi="Arial" w:cs="Arial"/>
-          <w:sz w:val="24"/>
-          <w:szCs w:val="24"/>
-          <w:lang w:val="en-GB"/>
-        </w:rPr>
-        <w:t>project</w:t>
-      </w:r>
-      <w:proofErr w:type="gramEnd"/>
-      <w:r>
-        <w:rPr>
-          <w:rFonts w:ascii="Arial" w:hAnsi="Arial" w:cs="Arial"/>
-          <w:sz w:val="24"/>
-          <w:szCs w:val="24"/>
-          <w:lang w:val="en-GB"/>
-        </w:rPr>
-        <w:t xml:space="preserve"> so we had to build everything from the ground up. </w:t>
-      </w:r>
-      <w:r>
-        <w:rPr>
-          <w:rFonts w:ascii="Arial" w:hAnsi="Arial" w:cs="Arial"/>
-          <w:sz w:val="24"/>
-          <w:szCs w:val="24"/>
-          <w:lang w:val="en-GB"/>
-        </w:rPr>
-        <w:t xml:space="preserve">Because of this, we had to acknowledge </w:t>
-      </w:r>
-      <w:r>
-        <w:rPr>
-          <w:rFonts w:ascii="Arial" w:hAnsi="Arial" w:cs="Arial"/>
-          <w:sz w:val="24"/>
-          <w:szCs w:val="24"/>
-          <w:lang w:val="en-GB"/>
-        </w:rPr>
-        <w:t xml:space="preserve">that making an </w:t>
-      </w:r>
-      <w:r>
-        <w:rPr>
-          <w:rFonts w:ascii="Arial" w:hAnsi="Arial" w:cs="Arial"/>
-          <w:sz w:val="24"/>
-          <w:szCs w:val="24"/>
-          <w:lang w:val="en-GB"/>
-        </w:rPr>
-        <w:t xml:space="preserve">AI was not feasible with the time we had to work on this </w:t>
-      </w:r>
-      <w:proofErr w:type="gramStart"/>
-      <w:r>
-        <w:rPr>
-          <w:rFonts w:ascii="Arial" w:hAnsi="Arial" w:cs="Arial"/>
-          <w:sz w:val="24"/>
-          <w:szCs w:val="24"/>
-          <w:lang w:val="en-GB"/>
-        </w:rPr>
-        <w:t>project</w:t>
-      </w:r>
-      <w:proofErr w:type="gramEnd"/>
-      <w:r>
-        <w:rPr>
-          <w:rFonts w:ascii="Arial" w:hAnsi="Arial" w:cs="Arial"/>
-          <w:sz w:val="24"/>
-          <w:szCs w:val="24"/>
-          <w:lang w:val="en-GB"/>
-        </w:rPr>
-        <w:t xml:space="preserve"> </w:t>
-      </w:r>
-      <w:r>
-        <w:rPr>
-          <w:rFonts w:ascii="Arial" w:hAnsi="Arial" w:cs="Arial"/>
-          <w:sz w:val="24"/>
-          <w:szCs w:val="24"/>
-          <w:lang w:val="en-GB"/>
-        </w:rPr>
-        <w:t>so we decided to lay the groundwork for the next groups and create a dashboard to show the progress.</w:t>
-      </w:r>
-    </w:p>
-    <w:p>
-      <w:pPr>
-        <w:tabs>
-          <w:tab w:val="center" w:pos="4513"/>
-        </w:tabs>
-        <w:rPr>
-          <w:rFonts w:ascii="Arial" w:hAnsi="Arial" w:cs="Arial"/>
-          <w:sz w:val="24"/>
-          <w:szCs w:val="24"/>
-          <w:lang w:val="en-GB"/>
-        </w:rPr>
-      </w:pPr>
-      <w:r>
-        <w:rPr>
-          <w:rFonts w:ascii="Arial" w:hAnsi="Arial" w:cs="Arial"/>
-          <w:sz w:val="24"/>
-          <w:szCs w:val="24"/>
-          <w:lang w:val="en-GB"/>
-        </w:rPr>
-        <w:t>We started with data collection, we collected: keyboard and mouse inputs</w:t>
-      </w:r>
-      <w:r>
-        <w:rPr>
-          <w:rFonts w:ascii="Arial" w:hAnsi="Arial" w:cs="Arial"/>
-          <w:sz w:val="24"/>
-          <w:szCs w:val="24"/>
-          <w:lang w:val="en-GB"/>
-        </w:rPr>
-        <w:t>,</w:t>
-      </w:r>
-      <w:r>
-        <w:rPr>
-          <w:rFonts w:ascii="Arial" w:hAnsi="Arial" w:cs="Arial"/>
-          <w:sz w:val="24"/>
-          <w:szCs w:val="24"/>
-          <w:lang w:val="en-GB"/>
-        </w:rPr>
-        <w:t xml:space="preserve"> gaze data</w:t>
-      </w:r>
-      <w:r>
-        <w:rPr>
-          <w:rFonts w:ascii="Arial" w:hAnsi="Arial" w:cs="Arial"/>
-          <w:sz w:val="24"/>
-          <w:szCs w:val="24"/>
-          <w:lang w:val="en-GB"/>
-        </w:rPr>
-        <w:t>,</w:t>
-      </w:r>
-      <w:r>
-        <w:rPr>
-          <w:rFonts w:ascii="Arial" w:hAnsi="Arial" w:cs="Arial"/>
-          <w:sz w:val="24"/>
-          <w:szCs w:val="24"/>
-          <w:lang w:val="en-GB"/>
-        </w:rPr>
-        <w:t xml:space="preserve"> facial expression data</w:t>
-      </w:r>
-      <w:r>
-        <w:rPr>
-          <w:rFonts w:ascii="Arial" w:hAnsi="Arial" w:cs="Arial"/>
-          <w:sz w:val="24"/>
-          <w:szCs w:val="24"/>
-          <w:lang w:val="en-GB"/>
-        </w:rPr>
-        <w:t>,</w:t>
-      </w:r>
-      <w:r>
-        <w:rPr>
-          <w:rFonts w:ascii="Arial" w:hAnsi="Arial" w:cs="Arial"/>
-          <w:sz w:val="24"/>
-          <w:szCs w:val="24"/>
-          <w:lang w:val="en-GB"/>
-        </w:rPr>
-        <w:t xml:space="preserve"> and video data. The input data </w:t>
-      </w:r>
-      <w:r>
-        <w:rPr>
-          <w:rFonts w:ascii="Arial" w:hAnsi="Arial" w:cs="Arial"/>
-          <w:sz w:val="24"/>
-          <w:szCs w:val="24"/>
-          <w:lang w:val="en-GB"/>
-        </w:rPr>
-        <w:t>is collected through a Python script, gaze data with a Tobii eye tracker, facial expressions or emotions with the use of a webcam and a computer vision algorithm provided by open-face and the video is recorded with OBS.</w:t>
-      </w:r>
-    </w:p>
-    <w:p>
-      <w:pPr>
-        <w:tabs>
-          <w:tab w:val="center" w:pos="4513"/>
-        </w:tabs>
-        <w:rPr>
-          <w:rFonts w:ascii="Arial" w:hAnsi="Arial" w:cs="Arial"/>
-          <w:sz w:val="24"/>
-          <w:szCs w:val="24"/>
-          <w:lang w:val="en-GB"/>
-        </w:rPr>
-      </w:pPr>
-      <w:r>
-        <w:rPr>
-          <w:rFonts w:ascii="Arial" w:hAnsi="Arial" w:cs="Arial"/>
-          <w:sz w:val="24"/>
-          <w:szCs w:val="24"/>
-          <w:lang w:val="en-GB"/>
-        </w:rPr>
-        <w:lastRenderedPageBreak/>
-        <w:t>After setting up the data collection we started building a data storage system, we decided on using SFTP for our bulk storage and PSQL for organizing the data. To make sure that everything would work on a server and to make it automatic we made a docker container that is running both the SFTP server and the PSQL server.</w:t>
-      </w:r>
-    </w:p>
-    <w:p>
-      <w:pPr>
-        <w:tabs>
-          <w:tab w:val="center" w:pos="4513"/>
-        </w:tabs>
-        <w:rPr>
-          <w:rFonts w:ascii="Arial" w:hAnsi="Arial" w:cs="Arial"/>
-          <w:sz w:val="24"/>
-          <w:szCs w:val="24"/>
-          <w:lang w:val="en-GB"/>
-        </w:rPr>
-      </w:pPr>
-      <w:r>
-        <w:rPr>
-          <w:rFonts w:ascii="Arial" w:hAnsi="Arial" w:cs="Arial"/>
-          <w:sz w:val="24"/>
-          <w:szCs w:val="24"/>
-          <w:lang w:val="en-GB"/>
-        </w:rPr>
-        <w:t>The last part of the project is to automate</w:t>
-      </w:r>
-      <w:r>
-        <w:rPr>
-          <w:rFonts w:ascii="Arial" w:hAnsi="Arial" w:cs="Arial"/>
-          <w:sz w:val="24"/>
-          <w:szCs w:val="24"/>
-          <w:lang w:val="en-GB"/>
-        </w:rPr>
-        <w:t xml:space="preserve"> </w:t>
-      </w:r>
-      <w:r>
-        <w:rPr>
-          <w:rFonts w:ascii="Arial" w:hAnsi="Arial" w:cs="Arial"/>
-          <w:sz w:val="24"/>
-          <w:szCs w:val="24"/>
-          <w:lang w:val="en-GB"/>
-        </w:rPr>
-        <w:t>it and make a dashboard. For the automation part, we made it so that when data collection stops it gets uploaded to the SFTP server and that the numeric data then gets uploaded to the PSQL server. Then if the dashboard wants to display some of the data it can find it in the PSQL server.</w:t>
-      </w:r>
-    </w:p>
-    <w:p>
-      <w:pPr>
-        <w:tabs>
-          <w:tab w:val="center" w:pos="4513"/>
-        </w:tabs>
-        <w:rPr>
-          <w:rFonts w:ascii="Arial" w:hAnsi="Arial" w:cs="Arial"/>
-          <w:sz w:val="24"/>
-          <w:szCs w:val="24"/>
-          <w:lang w:val="en-GB"/>
-        </w:rPr>
-      </w:pPr>
-      <w:r>
-        <w:rPr>
-          <w:rFonts w:ascii="Arial" w:hAnsi="Arial" w:cs="Arial"/>
-          <w:sz w:val="24"/>
-          <w:szCs w:val="24"/>
-          <w:lang w:val="en-GB"/>
-        </w:rPr>
-        <w:t xml:space="preserve">Below you can see a </w:t>
-      </w:r>
-      <w:proofErr w:type="gramStart"/>
-      <w:r>
-        <w:rPr>
-          <w:rFonts w:ascii="Arial" w:hAnsi="Arial" w:cs="Arial"/>
-          <w:sz w:val="24"/>
-          <w:szCs w:val="24"/>
-          <w:lang w:val="en-GB"/>
-        </w:rPr>
-        <w:t>sort</w:t>
-      </w:r>
-      <w:proofErr w:type="gramEnd"/>
-      <w:r>
-        <w:rPr>
-          <w:rFonts w:ascii="Arial" w:hAnsi="Arial" w:cs="Arial"/>
-          <w:sz w:val="24"/>
-          <w:szCs w:val="24"/>
-          <w:lang w:val="en-GB"/>
-        </w:rPr>
-        <w:t xml:space="preserve"> demo of the project.</w:t>
-      </w:r>
-    </w:p>
-    <w:p>
-      <w:pPr>
-        <w:tabs>
-          <w:tab w:val="center" w:pos="4513"/>
-        </w:tabs>
-        <w:rPr>
-          <w:rFonts w:ascii="Arial" w:hAnsi="Arial" w:cs="Arial"/>
-          <w:noProof/>
-          <w:sz w:val="24"/>
-          <w:szCs w:val="24"/>
-          <w:lang w:val="en-GB"/>
-        </w:rPr>
-      </w:pPr>
-      <w:r>
-        <w:rPr>
-          <w:rFonts w:ascii="Arial" w:hAnsi="Arial" w:cs="Arial"/>
-          <w:noProof/>
-          <w:sz w:val="24"/>
-          <w:szCs w:val="24"/>
-          <w:lang w:val="en-GB"/>
-        </w:rPr>
-        <w:drawing>
-          <wp:anchor distT="0" distB="0" distL="114300" distR="114300" simplePos="0" relativeHeight="251657216" behindDoc="0" locked="0" layoutInCell="1" allowOverlap="1" wp14:anchorId="095CC34E" wp14:editId="0DC75A54">
-            <wp:simplePos x="0" y="0"/>
-            <wp:positionH relativeFrom="margin">
-              <wp:align>center</wp:align>
-            </wp:positionH>
-            <wp:positionV relativeFrom="paragraph">
-              <wp:posOffset>5715</wp:posOffset>
-            </wp:positionV>
-            <wp:extent cx="5801812" cy="2872509"/>
-            <wp:effectExtent l="0" t="0" r="8890" b="4445"/>
-            <wp:wrapNone/>
-            <wp:docPr id="2066388558" name="Video 1" descr="short demo video">
-              <a:hlinkClick xmlns:a="http://schemas.openxmlformats.org/drawingml/2006/main" r:id="rId9"/>
-            </wp:docPr>
-            <wp:cNvGraphicFramePr>
-              <a:graphicFrameLocks xmlns:a="http://schemas.openxmlformats.org/drawingml/2006/main" noChangeAspect="1"/>
-            </wp:cNvGraphicFramePr>
-            <a:graphic xmlns:a="http://schemas.openxmlformats.org/drawingml/2006/main">
-              <a:graphicData uri="http://schemas.openxmlformats.org/drawingml/2006/picture">
-                <pic:pic xmlns:pic="http://schemas.openxmlformats.org/drawingml/2006/picture">
-                  <pic:nvPicPr>
-                    <pic:cNvPr id="2066388558" name="Video 1" descr="short demo video">
-                      <a:hlinkClick r:id="rId9"/>
-                    </pic:cNvPr>
-                    <pic:cNvPicPr/>
-                  </pic:nvPicPr>
-                  <pic:blipFill rotWithShape="1">
-                    <a:blip r:embed="rId10">
-                      <a:extLst>
-                        <a:ext uri="{28A0092B-C50C-407E-A947-70E740481C1C}">
-                          <a14:useLocalDpi xmlns:a14="http://schemas.microsoft.com/office/drawing/2010/main" val="0"/>
-                        </a:ext>
-                        <a:ext uri="{C809E66F-F1BF-436E-b5F7-EEA9579F0CBA}">
-                          <wp15:webVideoPr xmlns:wp15="http://schemas.microsoft.com/office/word/2012/wordprocessingDrawing" embeddedHtml="&lt;iframe width=&quot;200&quot; height=&quot;113&quot; src=&quot;https://www.youtube.com/embed/FPKSHeOVA-E?feature=oembed&quot; frameborder=&quot;0&quot; allow=&quot;accelerometer; autoplay; clipboard-write; encrypted-media; gyroscope; picture-in-picture; web-share&quot; referrerpolicy=&quot;strict-origin-when-cross-origin&quot; allowfullscreen=&quot;&quot; title=&quot;short demo video&quot; sandbox=&quot;allow-scripts allow-same-origin allow-popups&quot;&gt;&lt;/iframe&gt;" h="113" w="200"/>
-                        </a:ext>
-                      </a:extLst>
-                    </a:blip>
-                    <a:srcRect t="11835" b="11820"/>
-                    <a:stretch/>
-                  </pic:blipFill>
-                  <pic:spPr bwMode="auto">
-                    <a:xfrm>
-                      <a:off x="0" y="0"/>
-                      <a:ext cx="5801812" cy="2872509"/>
-                    </a:xfrm>
-                    <a:prstGeom prst="rect">
-                      <a:avLst/>
-                    </a:prstGeom>
-                    <a:ln>
-                      <a:noFill/>
-                    </a:ln>
-                    <a:extLst>
-                      <a:ext uri="{53640926-AAD7-44D8-BBD7-CCE9431645EC}">
-                        <a14:shadowObscured xmlns:a14="http://schemas.microsoft.com/office/drawing/2010/main"/>
-                      </a:ext>
-                    </a:extLst>
-                  </pic:spPr>
-                </pic:pic>
-              </a:graphicData>
-            </a:graphic>
-            <wp14:sizeRelH relativeFrom="margin">
-              <wp14:pctWidth>0</wp14:pctWidth>
-            </wp14:sizeRelH>
-            <wp14:sizeRelV relativeFrom="margin">
-              <wp14:pctHeight>0</wp14:pctHeight>
-            </wp14:sizeRelV>
-          </wp:anchor>
-        </w:drawing>
-      </w:r>
-    </w:p>
-    <w:p>
-      <w:pPr>
-        <w:tabs>
-          <w:tab w:val="center" w:pos="4513"/>
-        </w:tabs>
-        <w:rPr>
-          <w:rFonts w:ascii="Arial" w:hAnsi="Arial" w:cs="Arial"/>
-          <w:sz w:val="24"/>
-          <w:szCs w:val="24"/>
-          <w:lang w:val="en-GB"/>
-        </w:rPr>
-      </w:pPr>
-    </w:p>
-    <w:p>
-      <w:pPr>
-        <w:tabs>
-          <w:tab w:val="center" w:pos="4513"/>
-        </w:tabs>
-        <w:rPr>
-          <w:rFonts w:ascii="Arial" w:hAnsi="Arial" w:cs="Arial"/>
-          <w:sz w:val="24"/>
-          <w:szCs w:val="24"/>
-          <w:lang w:val="en-GB"/>
-        </w:rPr>
-      </w:pPr>
-    </w:p>
-    <w:p>
-      <w:pPr>
-        <w:tabs>
-          <w:tab w:val="center" w:pos="4513"/>
-        </w:tabs>
-        <w:rPr>
-          <w:rFonts w:ascii="Arial" w:hAnsi="Arial" w:cs="Arial"/>
-          <w:sz w:val="24"/>
-          <w:szCs w:val="24"/>
-          <w:lang w:val="en-GB"/>
-        </w:rPr>
-      </w:pPr>
-    </w:p>
-    <w:p>
-      <w:pPr>
-        <w:tabs>
-          <w:tab w:val="center" w:pos="4513"/>
-        </w:tabs>
-        <w:rPr>
-          <w:rFonts w:ascii="Arial" w:hAnsi="Arial" w:cs="Arial"/>
-          <w:sz w:val="24"/>
-          <w:szCs w:val="24"/>
-          <w:lang w:val="en-GB"/>
-        </w:rPr>
-      </w:pPr>
-    </w:p>
-    <w:p>
-      <w:pPr>
-        <w:tabs>
-          <w:tab w:val="center" w:pos="4513"/>
-        </w:tabs>
-        <w:rPr>
-          <w:rFonts w:ascii="Arial" w:hAnsi="Arial" w:cs="Arial"/>
-          <w:sz w:val="24"/>
-          <w:szCs w:val="24"/>
-          <w:lang w:val="en-GB"/>
-        </w:rPr>
-      </w:pPr>
-    </w:p>
-    <w:p>
-      <w:pPr>
-        <w:tabs>
-          <w:tab w:val="center" w:pos="4513"/>
-        </w:tabs>
-        <w:rPr>
-          <w:rFonts w:ascii="Arial" w:hAnsi="Arial" w:cs="Arial"/>
-          <w:sz w:val="24"/>
-          <w:szCs w:val="24"/>
-          <w:lang w:val="en-GB"/>
-        </w:rPr>
-      </w:pPr>
-    </w:p>
-    <w:p>
-      <w:pPr>
-        <w:tabs>
-          <w:tab w:val="center" w:pos="4513"/>
-        </w:tabs>
-        <w:rPr>
-          <w:rFonts w:ascii="Arial" w:hAnsi="Arial" w:cs="Arial"/>
-          <w:sz w:val="24"/>
-          <w:szCs w:val="24"/>
-          <w:lang w:val="en-GB"/>
-        </w:rPr>
-      </w:pPr>
-    </w:p>
-    <w:p>
-      <w:pPr>
-        <w:tabs>
-          <w:tab w:val="center" w:pos="4513"/>
-        </w:tabs>
-        <w:rPr>
-          <w:rFonts w:ascii="Arial" w:hAnsi="Arial" w:cs="Arial"/>
-          <w:sz w:val="24"/>
-          <w:szCs w:val="24"/>
-          <w:lang w:val="en-GB"/>
-        </w:rPr>
-      </w:pPr>
-    </w:p>
-    <w:p>
-      <w:pPr>
-        <w:rPr>
-          <w:rFonts w:ascii="Arial" w:hAnsi="Arial" w:cs="Arial"/>
-          <w:sz w:val="24"/>
-          <w:szCs w:val="24"/>
-          <w:lang w:val="en-GB"/>
-        </w:rPr>
-      </w:pPr>
-    </w:p>
-    <w:p>
-      <w:pPr>
-        <w:rPr>
-          <w:rFonts w:ascii="Arial" w:hAnsi="Arial"/>
-          <w:b/>
-          <w:sz w:val="24"/>
-          <w:szCs w:val="24"/>
-          <w:lang w:val="en-GB"/>
-        </w:rPr>
-      </w:pPr>
-    </w:p>
-    <w:p>
-      <w:pPr>
-        <w:rPr>
-          <w:rFonts w:ascii="Arial" w:hAnsi="Arial"/>
-          <w:b/>
-          <w:sz w:val="24"/>
-          <w:szCs w:val="24"/>
-          <w:lang w:val="en-GB"/>
-        </w:rPr>
-      </w:pPr>
-      <w:r>
-        <w:rPr>
-          <w:rFonts w:ascii="Arial" w:hAnsi="Arial"/>
-          <w:b/>
-          <w:sz w:val="24"/>
-          <w:szCs w:val="24"/>
-          <w:lang w:val="en-GB"/>
-        </w:rPr>
-        <w:t>Computer Vision NPEC</w:t>
-      </w:r>
-      <w:r>
-        <w:rPr>
-          <w:rFonts w:ascii="Arial" w:hAnsi="Arial"/>
-          <w:b/>
-          <w:sz w:val="24"/>
-          <w:szCs w:val="24"/>
-          <w:lang w:val="en-GB"/>
-        </w:rPr>
-        <w:t>:</w:t>
-      </w:r>
-    </w:p>
-    <w:p>
-      <w:pPr>
-        <w:tabs>
-          <w:tab w:val="center" w:pos="4513"/>
-        </w:tabs>
-        <w:rPr>
-          <w:rFonts w:ascii="Arial" w:hAnsi="Arial" w:cs="Arial"/>
-          <w:sz w:val="24"/>
-          <w:szCs w:val="24"/>
-          <w:lang w:val="en-GB"/>
-        </w:rPr>
-      </w:pPr>
-      <w:r>
-        <w:rPr>
-          <w:rFonts w:ascii="Arial" w:hAnsi="Arial" w:cs="Arial"/>
-          <w:sz w:val="24"/>
-          <w:szCs w:val="24"/>
-          <w:lang w:val="en-GB"/>
-        </w:rPr>
-        <w:t>For this project, I needed to make a computer vision algorithm that could Isolate the roots of plants</w:t>
-      </w:r>
-      <w:r>
-        <w:rPr>
-          <w:rFonts w:ascii="Arial" w:hAnsi="Arial" w:cs="Arial"/>
-          <w:sz w:val="24"/>
-          <w:szCs w:val="24"/>
-          <w:lang w:val="en-GB"/>
-        </w:rPr>
-        <w:t>, find the coordinates of all the root ends</w:t>
-      </w:r>
-      <w:r>
-        <w:rPr>
-          <w:rFonts w:ascii="Arial" w:hAnsi="Arial" w:cs="Arial"/>
-          <w:sz w:val="24"/>
-          <w:szCs w:val="24"/>
-          <w:lang w:val="en-GB"/>
-        </w:rPr>
-        <w:t>, calculate the length of the main root</w:t>
-      </w:r>
-      <w:r>
-        <w:rPr>
-          <w:rFonts w:ascii="Arial" w:hAnsi="Arial" w:cs="Arial"/>
-          <w:sz w:val="24"/>
-          <w:szCs w:val="24"/>
-          <w:lang w:val="en-GB"/>
-        </w:rPr>
-        <w:t xml:space="preserve"> and then move a robot to those coordinates and water the plants at these points</w:t>
-      </w:r>
-      <w:r>
-        <w:rPr>
-          <w:rFonts w:ascii="Arial" w:hAnsi="Arial" w:cs="Arial"/>
           <w:sz w:val="24"/>
           <w:szCs w:val="24"/>
           <w:lang w:val="en-GB"/>
@@ -5813,2034 +5046,668 @@
     </w:p>
     <w:p>
       <w:pPr>
-        <w:tabs>
-          <w:tab w:val="center" w:pos="4513"/>
-        </w:tabs>
-        <w:rPr>
-          <w:rFonts w:ascii="Arial" w:hAnsi="Arial" w:cs="Arial"/>
-          <w:sz w:val="24"/>
-          <w:szCs w:val="24"/>
-          <w:lang w:val="en-GB"/>
+        <w:spacing w:before="100" w:beforeAutospacing="1" w:after="100" w:afterAutospacing="1" w:line="240" w:lineRule="auto"/>
+        <w:rPr>
+          <w:rFonts w:ascii="Times New Roman" w:eastAsia="Times New Roman" w:hAnsi="Times New Roman" w:cs="Times New Roman"/>
+          <w:kern w:val="0"/>
+          <w:sz w:val="24"/>
+          <w:szCs w:val="24"/>
+          <w:lang w:eastAsia="en-GB"/>
+          <w14:ligatures w14:val="none"/>
         </w:rPr>
       </w:pPr>
       <w:r>
         <w:rPr>
-          <w:rFonts w:ascii="Arial" w:hAnsi="Arial" w:cs="Arial"/>
-          <w:sz w:val="24"/>
-          <w:szCs w:val="24"/>
-          <w:lang w:val="en-GB"/>
-        </w:rPr>
-        <w:t xml:space="preserve">The algorithm I used for this is a convolutional neural network or CNN called U-Net. A U-Net model specialises in image segmentation </w:t>
-      </w:r>
-      <w:r>
-        <w:rPr>
-          <w:rFonts w:ascii="Arial" w:hAnsi="Arial" w:cs="Arial"/>
-          <w:sz w:val="24"/>
-          <w:szCs w:val="24"/>
-          <w:lang w:val="en-GB"/>
-        </w:rPr>
-        <w:t>which</w:t>
-      </w:r>
-      <w:r>
-        <w:rPr>
-          <w:rFonts w:ascii="Arial" w:hAnsi="Arial" w:cs="Arial"/>
-          <w:sz w:val="24"/>
-          <w:szCs w:val="24"/>
-          <w:lang w:val="en-GB"/>
-        </w:rPr>
-        <w:t xml:space="preserve"> means that the model works with only segments or parts of the image</w:t>
-      </w:r>
-      <w:r>
-        <w:rPr>
-          <w:rFonts w:ascii="Arial" w:hAnsi="Arial" w:cs="Arial"/>
-          <w:sz w:val="24"/>
-          <w:szCs w:val="24"/>
-          <w:lang w:val="en-GB"/>
-        </w:rPr>
-        <w:t>(1.)</w:t>
-      </w:r>
-      <w:r>
-        <w:rPr>
-          <w:rFonts w:ascii="Arial" w:hAnsi="Arial" w:cs="Arial"/>
-          <w:sz w:val="24"/>
-          <w:szCs w:val="24"/>
-          <w:lang w:val="en-GB"/>
-        </w:rPr>
-        <w:t xml:space="preserve"> instead of trying to process the whole </w:t>
-      </w:r>
-      <w:r>
-        <w:rPr>
-          <w:rFonts w:ascii="Arial" w:hAnsi="Arial" w:cs="Arial"/>
-          <w:sz w:val="24"/>
-          <w:szCs w:val="24"/>
-          <w:lang w:val="en-GB"/>
-        </w:rPr>
-        <w:t>picture</w:t>
-      </w:r>
-      <w:r>
-        <w:rPr>
-          <w:rFonts w:ascii="Arial" w:hAnsi="Arial" w:cs="Arial"/>
-          <w:sz w:val="24"/>
-          <w:szCs w:val="24"/>
-          <w:lang w:val="en-GB"/>
-        </w:rPr>
-        <w:t xml:space="preserve"> at once, one of the reasons to do this is to reduce the </w:t>
-      </w:r>
-      <w:r>
-        <w:rPr>
-          <w:rFonts w:ascii="Arial" w:hAnsi="Arial" w:cs="Arial"/>
-          <w:sz w:val="24"/>
-          <w:szCs w:val="24"/>
-          <w:lang w:val="en-GB"/>
-        </w:rPr>
-        <w:t>workload</w:t>
-      </w:r>
-      <w:r>
-        <w:rPr>
-          <w:rFonts w:ascii="Arial" w:hAnsi="Arial" w:cs="Arial"/>
-          <w:sz w:val="24"/>
-          <w:szCs w:val="24"/>
-          <w:lang w:val="en-GB"/>
-        </w:rPr>
-        <w:t xml:space="preserve"> for </w:t>
-      </w:r>
-      <w:r>
-        <w:rPr>
-          <w:rFonts w:ascii="Arial" w:hAnsi="Arial" w:cs="Arial"/>
-          <w:sz w:val="24"/>
-          <w:szCs w:val="24"/>
-          <w:lang w:val="en-GB"/>
-        </w:rPr>
-        <w:t>so the model is</w:t>
-      </w:r>
-      <w:r>
-        <w:rPr>
-          <w:rFonts w:ascii="Arial" w:hAnsi="Arial" w:cs="Arial"/>
-          <w:sz w:val="24"/>
-          <w:szCs w:val="24"/>
-          <w:lang w:val="en-GB"/>
-        </w:rPr>
-        <w:t xml:space="preserve"> able to run and run faster</w:t>
-      </w:r>
-      <w:r>
-        <w:rPr>
-          <w:rFonts w:ascii="Arial" w:hAnsi="Arial" w:cs="Arial"/>
-          <w:sz w:val="24"/>
-          <w:szCs w:val="24"/>
-          <w:lang w:val="en-GB"/>
-        </w:rPr>
-        <w:t xml:space="preserve"> than other models</w:t>
-      </w:r>
-      <w:r>
-        <w:rPr>
-          <w:rFonts w:ascii="Arial" w:hAnsi="Arial" w:cs="Arial"/>
-          <w:sz w:val="24"/>
-          <w:szCs w:val="24"/>
-          <w:lang w:val="en-GB"/>
-        </w:rPr>
-        <w:t>.</w:t>
-      </w:r>
-      <w:r>
-        <w:rPr>
-          <w:rFonts w:ascii="Arial" w:hAnsi="Arial" w:cs="Arial"/>
-          <w:sz w:val="24"/>
-          <w:szCs w:val="24"/>
-          <w:lang w:val="en-GB"/>
-        </w:rPr>
-        <w:t xml:space="preserve"> The </w:t>
-      </w:r>
-      <w:r>
-        <w:rPr>
-          <w:rFonts w:ascii="Arial" w:hAnsi="Arial" w:cs="Arial"/>
-          <w:sz w:val="24"/>
-          <w:szCs w:val="24"/>
-          <w:lang w:val="en-GB"/>
-        </w:rPr>
-        <w:t xml:space="preserve">model's </w:t>
-      </w:r>
-      <w:proofErr w:type="gramStart"/>
-      <w:r>
-        <w:rPr>
-          <w:rFonts w:ascii="Arial" w:hAnsi="Arial" w:cs="Arial"/>
-          <w:sz w:val="24"/>
-          <w:szCs w:val="24"/>
-          <w:lang w:val="en-GB"/>
-        </w:rPr>
-        <w:t>output(</w:t>
-      </w:r>
-      <w:proofErr w:type="gramEnd"/>
-      <w:r>
-        <w:rPr>
-          <w:rFonts w:ascii="Arial" w:hAnsi="Arial" w:cs="Arial"/>
-          <w:sz w:val="24"/>
-          <w:szCs w:val="24"/>
-          <w:lang w:val="en-GB"/>
-        </w:rPr>
-        <w:t xml:space="preserve">3.) </w:t>
-      </w:r>
-      <w:r>
-        <w:rPr>
-          <w:rFonts w:ascii="Arial" w:hAnsi="Arial" w:cs="Arial"/>
-          <w:sz w:val="24"/>
-          <w:szCs w:val="24"/>
-          <w:lang w:val="en-GB"/>
-        </w:rPr>
-        <w:t xml:space="preserve">was not bad either with a little bit of cleaning the </w:t>
-      </w:r>
-      <w:r>
-        <w:rPr>
-          <w:rFonts w:ascii="Arial" w:hAnsi="Arial" w:cs="Arial"/>
-          <w:sz w:val="24"/>
-          <w:szCs w:val="24"/>
-          <w:lang w:val="en-GB"/>
-        </w:rPr>
-        <w:t>picture, and</w:t>
-      </w:r>
-      <w:r>
-        <w:rPr>
-          <w:rFonts w:ascii="Arial" w:hAnsi="Arial" w:cs="Arial"/>
-          <w:sz w:val="24"/>
-          <w:szCs w:val="24"/>
-          <w:lang w:val="en-GB"/>
-        </w:rPr>
-        <w:t xml:space="preserve"> I had something I could work with</w:t>
-      </w:r>
-      <w:r>
-        <w:rPr>
-          <w:rFonts w:ascii="Arial" w:hAnsi="Arial" w:cs="Arial"/>
-          <w:sz w:val="24"/>
-          <w:szCs w:val="24"/>
-          <w:lang w:val="en-GB"/>
-        </w:rPr>
-        <w:t>.</w:t>
+          <w:rFonts w:ascii="Times New Roman" w:eastAsia="Times New Roman" w:hAnsi="Times New Roman" w:cs="Times New Roman"/>
+          <w:b/>
+          <w:bCs/>
+          <w:kern w:val="0"/>
+          <w:sz w:val="24"/>
+          <w:szCs w:val="24"/>
+          <w:lang w:eastAsia="en-GB"/>
+          <w14:ligatures w14:val="none"/>
+        </w:rPr>
+        <w:t>Research Manager &amp; DevOps Lead — The Hive, Breda Guardians (BUas) (Feb 2026 - Jun 2026)</w:t>
       </w:r>
     </w:p>
     <w:p>
       <w:pPr>
-        <w:tabs>
-          <w:tab w:val="center" w:pos="4513"/>
-        </w:tabs>
-        <w:rPr>
-          <w:rFonts w:ascii="Arial" w:hAnsi="Arial" w:cs="Arial"/>
-          <w:sz w:val="24"/>
-          <w:szCs w:val="24"/>
-          <w:lang w:val="en-GB"/>
+        <w:numPr>
+          <w:ilvl w:val="0"/>
+          <w:numId w:val="2"/>
+        </w:numPr>
+        <w:spacing w:before="100" w:beforeAutospacing="1" w:after="100" w:afterAutospacing="1" w:line="240" w:lineRule="auto"/>
+        <w:rPr>
+          <w:rFonts w:ascii="Times New Roman" w:eastAsia="Times New Roman" w:hAnsi="Times New Roman" w:cs="Times New Roman"/>
+          <w:kern w:val="0"/>
+          <w:sz w:val="24"/>
+          <w:szCs w:val="24"/>
+          <w:lang w:eastAsia="en-GB"/>
+          <w14:ligatures w14:val="none"/>
         </w:rPr>
       </w:pPr>
       <w:r>
         <w:rPr>
-          <w:rFonts w:ascii="Arial" w:hAnsi="Arial" w:cs="Arial"/>
-          <w:noProof/>
-          <w:sz w:val="24"/>
-          <w:szCs w:val="24"/>
-          <w:lang w:val="en-GB"/>
-        </w:rPr>
-        <mc:AlternateContent>
-          <mc:Choice Requires="wpg">
-            <w:drawing>
-              <wp:inline distT="0" distB="0" distL="0" distR="0" wp14:anchorId="30715E3E" wp14:editId="39A67ED7">
-                <wp:extent cx="6645910" cy="2404110"/>
-                <wp:effectExtent l="0" t="0" r="21590" b="15240"/>
-                <wp:docPr id="289307874" name="Group 7"/>
-                <wp:cNvGraphicFramePr/>
-                <a:graphic xmlns:a="http://schemas.openxmlformats.org/drawingml/2006/main">
-                  <a:graphicData uri="http://schemas.microsoft.com/office/word/2010/wordprocessingGroup">
-                    <wpg:wgp>
-                      <wpg:cNvGrpSpPr/>
-                      <wpg:grpSpPr>
-                        <a:xfrm>
-                          <a:off x="0" y="0"/>
-                          <a:ext cx="6645910" cy="2404110"/>
-                          <a:chOff x="0" y="0"/>
-                          <a:chExt cx="6847043" cy="2477238"/>
-                        </a:xfrm>
-                      </wpg:grpSpPr>
-                      <pic:pic xmlns:pic="http://schemas.openxmlformats.org/drawingml/2006/picture">
-                        <pic:nvPicPr>
-                          <pic:cNvPr id="1538950459" name="Picture 3"/>
-                          <pic:cNvPicPr>
-                            <a:picLocks noChangeAspect="1"/>
-                          </pic:cNvPicPr>
-                        </pic:nvPicPr>
-                        <pic:blipFill>
-                          <a:blip r:embed="rId11">
-                            <a:extLst>
-                              <a:ext uri="{28A0092B-C50C-407E-A947-70E740481C1C}">
-                                <a14:useLocalDpi xmlns:a14="http://schemas.microsoft.com/office/drawing/2010/main" val="0"/>
-                              </a:ext>
-                            </a:extLst>
-                          </a:blip>
-                          <a:srcRect/>
-                          <a:stretch>
-                            <a:fillRect/>
-                          </a:stretch>
-                        </pic:blipFill>
-                        <pic:spPr bwMode="auto">
-                          <a:xfrm>
-                            <a:off x="9885" y="9885"/>
-                            <a:ext cx="2152015" cy="2071370"/>
-                          </a:xfrm>
-                          <a:prstGeom prst="rect">
-                            <a:avLst/>
-                          </a:prstGeom>
-                          <a:noFill/>
-                          <a:ln>
-                            <a:noFill/>
-                          </a:ln>
-                        </pic:spPr>
-                      </pic:pic>
-                      <pic:pic xmlns:pic="http://schemas.openxmlformats.org/drawingml/2006/picture">
-                        <pic:nvPicPr>
-                          <pic:cNvPr id="1642750899" name="Picture 4"/>
-                          <pic:cNvPicPr>
-                            <a:picLocks noChangeAspect="1"/>
-                          </pic:cNvPicPr>
-                        </pic:nvPicPr>
-                        <pic:blipFill>
-                          <a:blip r:embed="rId12">
-                            <a:extLst>
-                              <a:ext uri="{28A0092B-C50C-407E-A947-70E740481C1C}">
-                                <a14:useLocalDpi xmlns:a14="http://schemas.microsoft.com/office/drawing/2010/main" val="0"/>
-                              </a:ext>
-                            </a:extLst>
-                          </a:blip>
-                          <a:srcRect/>
-                          <a:stretch>
-                            <a:fillRect/>
-                          </a:stretch>
-                        </pic:blipFill>
-                        <pic:spPr bwMode="auto">
-                          <a:xfrm>
-                            <a:off x="2357669" y="9885"/>
-                            <a:ext cx="2160270" cy="2080260"/>
-                          </a:xfrm>
-                          <a:prstGeom prst="rect">
-                            <a:avLst/>
-                          </a:prstGeom>
-                          <a:noFill/>
-                          <a:ln>
-                            <a:noFill/>
-                          </a:ln>
-                        </pic:spPr>
-                      </pic:pic>
-                      <pic:pic xmlns:pic="http://schemas.openxmlformats.org/drawingml/2006/picture">
-                        <pic:nvPicPr>
-                          <pic:cNvPr id="35724551" name="Picture 5"/>
-                          <pic:cNvPicPr>
-                            <a:picLocks noChangeAspect="1"/>
-                          </pic:cNvPicPr>
-                        </pic:nvPicPr>
-                        <pic:blipFill>
-                          <a:blip r:embed="rId13">
-                            <a:extLst>
-                              <a:ext uri="{28A0092B-C50C-407E-A947-70E740481C1C}">
-                                <a14:useLocalDpi xmlns:a14="http://schemas.microsoft.com/office/drawing/2010/main" val="0"/>
-                              </a:ext>
-                            </a:extLst>
-                          </a:blip>
-                          <a:srcRect/>
-                          <a:stretch>
-                            <a:fillRect/>
-                          </a:stretch>
-                        </pic:blipFill>
-                        <pic:spPr bwMode="auto">
-                          <a:xfrm>
-                            <a:off x="4675797" y="0"/>
-                            <a:ext cx="2162810" cy="2082800"/>
-                          </a:xfrm>
-                          <a:prstGeom prst="rect">
-                            <a:avLst/>
-                          </a:prstGeom>
-                          <a:noFill/>
-                          <a:ln>
-                            <a:noFill/>
-                          </a:ln>
-                        </pic:spPr>
-                      </pic:pic>
-                      <wps:wsp>
-                        <wps:cNvPr id="49837775" name="Text Box 6"/>
-                        <wps:cNvSpPr txBox="1"/>
-                        <wps:spPr>
-                          <a:xfrm>
-                            <a:off x="0" y="2145133"/>
-                            <a:ext cx="2159864" cy="332105"/>
-                          </a:xfrm>
-                          <a:prstGeom prst="rect">
-                            <a:avLst/>
-                          </a:prstGeom>
-                          <a:noFill/>
-                          <a:ln w="9525" cap="flat" cmpd="sng" algn="ctr">
-                            <a:solidFill>
-                              <a:schemeClr val="bg1"/>
-                            </a:solidFill>
-                            <a:prstDash val="solid"/>
-                            <a:round/>
-                            <a:headEnd type="none" w="med" len="med"/>
-                            <a:tailEnd type="none" w="med" len="med"/>
-                          </a:ln>
-                        </wps:spPr>
-                        <wps:style>
-                          <a:lnRef idx="0">
-                            <a:scrgbClr r="0" g="0" b="0"/>
-                          </a:lnRef>
-                          <a:fillRef idx="0">
-                            <a:scrgbClr r="0" g="0" b="0"/>
-                          </a:fillRef>
-                          <a:effectRef idx="0">
-                            <a:scrgbClr r="0" g="0" b="0"/>
-                          </a:effectRef>
-                          <a:fontRef idx="minor">
-                            <a:schemeClr val="dk1"/>
-                          </a:fontRef>
-                        </wps:style>
-                        <wps:txbx>
-                          <w:txbxContent>
-                            <w:p>
-                              <w:pPr>
-                                <w:jc w:val="center"/>
-                                <w:rPr>
-                                  <w:lang w:val="en-GB"/>
-                                </w:rPr>
-                              </w:pPr>
-                              <w:r>
-                                <w:rPr>
-                                  <w:lang w:val="en-GB"/>
-                                </w:rPr>
-                                <w:t>1. How pictures get segmented.</w:t>
-                              </w:r>
-                            </w:p>
-                          </w:txbxContent>
-                        </wps:txbx>
-                        <wps:bodyPr rot="0" spcFirstLastPara="0" vertOverflow="overflow" horzOverflow="overflow" vert="horz" wrap="square" lIns="91440" tIns="45720" rIns="91440" bIns="45720" numCol="1" spcCol="0" rtlCol="0" fromWordArt="0" anchor="t" anchorCtr="0" forceAA="0" compatLnSpc="1">
-                          <a:prstTxWarp prst="textNoShape">
-                            <a:avLst/>
-                          </a:prstTxWarp>
-                          <a:noAutofit/>
-                        </wps:bodyPr>
-                      </wps:wsp>
-                      <wps:wsp>
-                        <wps:cNvPr id="1003334059" name="Text Box 6"/>
-                        <wps:cNvSpPr txBox="1"/>
-                        <wps:spPr>
-                          <a:xfrm>
-                            <a:off x="2357669" y="2145133"/>
-                            <a:ext cx="2166304" cy="332105"/>
-                          </a:xfrm>
-                          <a:prstGeom prst="rect">
-                            <a:avLst/>
-                          </a:prstGeom>
-                          <a:noFill/>
-                          <a:ln w="9525" cap="flat" cmpd="sng" algn="ctr">
-                            <a:solidFill>
-                              <a:schemeClr val="bg1"/>
-                            </a:solidFill>
-                            <a:prstDash val="solid"/>
-                            <a:round/>
-                            <a:headEnd type="none" w="med" len="med"/>
-                            <a:tailEnd type="none" w="med" len="med"/>
-                          </a:ln>
-                        </wps:spPr>
-                        <wps:style>
-                          <a:lnRef idx="0">
-                            <a:scrgbClr r="0" g="0" b="0"/>
-                          </a:lnRef>
-                          <a:fillRef idx="0">
-                            <a:scrgbClr r="0" g="0" b="0"/>
-                          </a:fillRef>
-                          <a:effectRef idx="0">
-                            <a:scrgbClr r="0" g="0" b="0"/>
-                          </a:effectRef>
-                          <a:fontRef idx="minor">
-                            <a:schemeClr val="dk1"/>
-                          </a:fontRef>
-                        </wps:style>
-                        <wps:txbx>
-                          <w:txbxContent>
-                            <w:p>
-                              <w:pPr>
-                                <w:jc w:val="center"/>
-                                <w:rPr>
-                                  <w:lang w:val="en-GB"/>
-                                </w:rPr>
-                              </w:pPr>
-                              <w:r>
-                                <w:rPr>
-                                  <w:lang w:val="en-GB"/>
-                                </w:rPr>
-                                <w:t>2. Input picture for the model.</w:t>
-                              </w:r>
-                            </w:p>
-                          </w:txbxContent>
-                        </wps:txbx>
-                        <wps:bodyPr rot="0" spcFirstLastPara="0" vertOverflow="overflow" horzOverflow="overflow" vert="horz" wrap="square" lIns="91440" tIns="45720" rIns="91440" bIns="45720" numCol="1" spcCol="0" rtlCol="0" fromWordArt="0" anchor="t" anchorCtr="0" forceAA="0" compatLnSpc="1">
-                          <a:prstTxWarp prst="textNoShape">
-                            <a:avLst/>
-                          </a:prstTxWarp>
-                          <a:noAutofit/>
-                        </wps:bodyPr>
-                      </wps:wsp>
-                      <wps:wsp>
-                        <wps:cNvPr id="462491399" name="Text Box 6"/>
-                        <wps:cNvSpPr txBox="1"/>
-                        <wps:spPr>
-                          <a:xfrm>
-                            <a:off x="4680739" y="2140190"/>
-                            <a:ext cx="2166304" cy="332105"/>
-                          </a:xfrm>
-                          <a:prstGeom prst="rect">
-                            <a:avLst/>
-                          </a:prstGeom>
-                          <a:noFill/>
-                          <a:ln w="9525" cap="flat" cmpd="sng" algn="ctr">
-                            <a:solidFill>
-                              <a:schemeClr val="bg1"/>
-                            </a:solidFill>
-                            <a:prstDash val="solid"/>
-                            <a:round/>
-                            <a:headEnd type="none" w="med" len="med"/>
-                            <a:tailEnd type="none" w="med" len="med"/>
-                          </a:ln>
-                        </wps:spPr>
-                        <wps:style>
-                          <a:lnRef idx="0">
-                            <a:scrgbClr r="0" g="0" b="0"/>
-                          </a:lnRef>
-                          <a:fillRef idx="0">
-                            <a:scrgbClr r="0" g="0" b="0"/>
-                          </a:fillRef>
-                          <a:effectRef idx="0">
-                            <a:scrgbClr r="0" g="0" b="0"/>
-                          </a:effectRef>
-                          <a:fontRef idx="minor">
-                            <a:schemeClr val="dk1"/>
-                          </a:fontRef>
-                        </wps:style>
-                        <wps:txbx>
-                          <w:txbxContent>
-                            <w:p>
-                              <w:pPr>
-                                <w:jc w:val="center"/>
-                                <w:rPr>
-                                  <w:lang w:val="en-GB"/>
-                                </w:rPr>
-                              </w:pPr>
-                              <w:r>
-                                <w:rPr>
-                                  <w:lang w:val="en-GB"/>
-                                </w:rPr>
-                                <w:t>3. Output of the model.</w:t>
-                              </w:r>
-                            </w:p>
-                          </w:txbxContent>
-                        </wps:txbx>
-                        <wps:bodyPr rot="0" spcFirstLastPara="0" vertOverflow="overflow" horzOverflow="overflow" vert="horz" wrap="square" lIns="91440" tIns="45720" rIns="91440" bIns="45720" numCol="1" spcCol="0" rtlCol="0" fromWordArt="0" anchor="t" anchorCtr="0" forceAA="0" compatLnSpc="1">
-                          <a:prstTxWarp prst="textNoShape">
-                            <a:avLst/>
-                          </a:prstTxWarp>
-                          <a:noAutofit/>
-                        </wps:bodyPr>
-                      </wps:wsp>
-                    </wpg:wgp>
-                  </a:graphicData>
-                </a:graphic>
-              </wp:inline>
-            </w:drawing>
-          </mc:Choice>
-          <mc:Fallback>
-            <w:pict>
-              <v:group w14:anchorId="30715E3E" id="Group 7" o:spid="_x0000_s1026" style="width:523.3pt;height:189.3pt;mso-position-horizontal-relative:char;mso-position-vertical-relative:line" coordsize="68470,24772" o:gfxdata="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">
-                <v:shapetype id="_x0000_t75" coordsize="21600,21600" o:spt="75" o:preferrelative="t" path="m@4@5l@4@11@9@11@9@5xe" filled="f" stroked="f">
-                  <v:stroke joinstyle="miter"/>
-                  <v:formulas>
-                    <v:f eqn="if lineDrawn pixelLineWidth 0"/>
-                    <v:f eqn="sum @0 1 0"/>
-                    <v:f eqn="sum 0 0 @1"/>
-                    <v:f eqn="prod @2 1 2"/>
-                    <v:f eqn="prod @3 21600 pixelWidth"/>
-                    <v:f eqn="prod @3 21600 pixelHeight"/>
-                    <v:f eqn="sum @0 0 1"/>
-                    <v:f eqn="prod @6 1 2"/>
-                    <v:f eqn="prod @7 21600 pixelWidth"/>
-                    <v:f eqn="sum @8 21600 0"/>
-                    <v:f eqn="prod @7 21600 pixelHeight"/>
-                    <v:f eqn="sum @10 21600 0"/>
-                  </v:formulas>
-                  <v:path o:extrusionok="f" gradientshapeok="t" o:connecttype="rect"/>
-                  <o:lock v:ext="edit" aspectratio="t"/>
-                </v:shapetype>
-                <v:shape id="Picture 3" o:spid="_x0000_s1027" type="#_x0000_t75" style="position:absolute;left:98;top:98;width:21521;height:20714;visibility:visible;mso-wrap-style:square" o:gfxdata="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">
-                  <v:imagedata r:id="rId14" o:title=""/>
-                </v:shape>
-                <v:shape id="Picture 4" o:spid="_x0000_s1028" type="#_x0000_t75" style="position:absolute;left:23576;top:98;width:21603;height:20803;visibility:visible;mso-wrap-style:square" o:gfxdata="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">
-                  <v:imagedata r:id="rId15" o:title=""/>
-                </v:shape>
-                <v:shape id="Picture 5" o:spid="_x0000_s1029" type="#_x0000_t75" style="position:absolute;left:46757;width:21629;height:20828;visibility:visible;mso-wrap-style:square" o:gfxdata="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">
-                  <v:imagedata r:id="rId16" o:title=""/>
-                </v:shape>
-                <v:shapetype id="_x0000_t202" coordsize="21600,21600" o:spt="202" path="m,l,21600r21600,l21600,xe">
-                  <v:stroke joinstyle="miter"/>
-                  <v:path gradientshapeok="t" o:connecttype="rect"/>
-                </v:shapetype>
-                <v:shape id="_x0000_s1030" type="#_x0000_t202" style="position:absolute;top:21451;width:21598;height:3321;visibility:visible;mso-wrap-style:square;v-text-anchor:top" o:gfxdata="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" filled="f" strokecolor="white [3212]">
-                  <v:stroke joinstyle="round"/>
-                  <v:textbox>
-                    <w:txbxContent>
-                      <w:p>
-                        <w:pPr>
-                          <w:jc w:val="center"/>
-                          <w:rPr>
-                            <w:lang w:val="en-GB"/>
-                          </w:rPr>
-                        </w:pPr>
-                        <w:r>
-                          <w:rPr>
-                            <w:lang w:val="en-GB"/>
-                          </w:rPr>
-                          <w:t>1. How pictures get segmented.</w:t>
-                        </w:r>
-                      </w:p>
-                    </w:txbxContent>
-                  </v:textbox>
-                </v:shape>
-                <v:shape id="_x0000_s1031" type="#_x0000_t202" style="position:absolute;left:23576;top:21451;width:21663;height:3321;visibility:visible;mso-wrap-style:square;v-text-anchor:top" o:gfxdata="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" filled="f" strokecolor="white [3212]">
-                  <v:stroke joinstyle="round"/>
-                  <v:textbox>
-                    <w:txbxContent>
-                      <w:p>
-                        <w:pPr>
-                          <w:jc w:val="center"/>
-                          <w:rPr>
-                            <w:lang w:val="en-GB"/>
-                          </w:rPr>
-                        </w:pPr>
-                        <w:r>
-                          <w:rPr>
-                            <w:lang w:val="en-GB"/>
-                          </w:rPr>
-                          <w:t>2. Input picture for the model.</w:t>
-                        </w:r>
-                      </w:p>
-                    </w:txbxContent>
-                  </v:textbox>
-                </v:shape>
-                <v:shape id="_x0000_s1032" type="#_x0000_t202" style="position:absolute;left:46807;top:21401;width:21663;height:3321;visibility:visible;mso-wrap-style:square;v-text-anchor:top" o:gfxdata="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" filled="f" strokecolor="white [3212]">
-                  <v:stroke joinstyle="round"/>
-                  <v:textbox>
-                    <w:txbxContent>
-                      <w:p>
-                        <w:pPr>
-                          <w:jc w:val="center"/>
-                          <w:rPr>
-                            <w:lang w:val="en-GB"/>
-                          </w:rPr>
-                        </w:pPr>
-                        <w:r>
-                          <w:rPr>
-                            <w:lang w:val="en-GB"/>
-                          </w:rPr>
-                          <w:t>3. Output of the model.</w:t>
-                        </w:r>
-                      </w:p>
-                    </w:txbxContent>
-                  </v:textbox>
-                </v:shape>
-                <w10:anchorlock/>
-              </v:group>
-            </w:pict>
-          </mc:Fallback>
-        </mc:AlternateContent>
+          <w:rFonts w:ascii="Times New Roman" w:eastAsia="Times New Roman" w:hAnsi="Times New Roman" w:cs="Times New Roman"/>
+          <w:kern w:val="0"/>
+          <w:sz w:val="24"/>
+          <w:szCs w:val="24"/>
+          <w:lang w:eastAsia="en-GB"/>
+          <w14:ligatures w14:val="none"/>
+        </w:rPr>
+        <w:t>Migrated a multi-institutional esports analytics toolkit (Play-Smart) from manual, USB-based deployment to a version-controlled, containerized GitHub Actions workflow, coordinating contributions across BUas, Tilburg University, and the University of Twente</w:t>
       </w:r>
     </w:p>
     <w:p>
       <w:pPr>
-        <w:tabs>
-          <w:tab w:val="center" w:pos="4513"/>
-        </w:tabs>
-        <w:rPr>
-          <w:noProof/>
-          <w:sz w:val="24"/>
-          <w:szCs w:val="24"/>
+        <w:numPr>
+          <w:ilvl w:val="0"/>
+          <w:numId w:val="2"/>
+        </w:numPr>
+        <w:spacing w:before="100" w:beforeAutospacing="1" w:after="100" w:afterAutospacing="1" w:line="240" w:lineRule="auto"/>
+        <w:rPr>
+          <w:rFonts w:ascii="Times New Roman" w:eastAsia="Times New Roman" w:hAnsi="Times New Roman" w:cs="Times New Roman"/>
+          <w:kern w:val="0"/>
+          <w:sz w:val="24"/>
+          <w:szCs w:val="24"/>
+          <w:lang w:eastAsia="en-GB"/>
+          <w14:ligatures w14:val="none"/>
         </w:rPr>
       </w:pPr>
       <w:r>
         <w:rPr>
-          <w:noProof/>
-        </w:rPr>
-        <w:lastRenderedPageBreak/>
-        <mc:AlternateContent>
-          <mc:Choice Requires="wps">
-            <w:drawing>
-              <wp:anchor distT="0" distB="0" distL="114300" distR="114300" simplePos="0" relativeHeight="251664384" behindDoc="0" locked="0" layoutInCell="1" allowOverlap="1" wp14:anchorId="137D975D" wp14:editId="251E0AA1">
-                <wp:simplePos x="0" y="0"/>
-                <wp:positionH relativeFrom="column">
-                  <wp:posOffset>3813810</wp:posOffset>
-                </wp:positionH>
-                <wp:positionV relativeFrom="paragraph">
-                  <wp:posOffset>2881102</wp:posOffset>
-                </wp:positionV>
-                <wp:extent cx="2592682" cy="322301"/>
-                <wp:effectExtent l="0" t="0" r="17780" b="20955"/>
-                <wp:wrapNone/>
-                <wp:docPr id="1378823797" name="Text Box 6"/>
-                <wp:cNvGraphicFramePr/>
-                <a:graphic xmlns:a="http://schemas.openxmlformats.org/drawingml/2006/main">
-                  <a:graphicData uri="http://schemas.microsoft.com/office/word/2010/wordprocessingShape">
-                    <wps:wsp>
-                      <wps:cNvSpPr txBox="1"/>
-                      <wps:spPr>
-                        <a:xfrm>
-                          <a:off x="0" y="0"/>
-                          <a:ext cx="2592682" cy="322301"/>
-                        </a:xfrm>
-                        <a:prstGeom prst="rect">
-                          <a:avLst/>
-                        </a:prstGeom>
-                        <a:noFill/>
-                        <a:ln w="9525" cap="flat" cmpd="sng" algn="ctr">
-                          <a:solidFill>
-                            <a:schemeClr val="bg1"/>
-                          </a:solidFill>
-                          <a:prstDash val="solid"/>
-                          <a:round/>
-                          <a:headEnd type="none" w="med" len="med"/>
-                          <a:tailEnd type="none" w="med" len="med"/>
-                        </a:ln>
-                      </wps:spPr>
-                      <wps:style>
-                        <a:lnRef idx="0">
-                          <a:scrgbClr r="0" g="0" b="0"/>
-                        </a:lnRef>
-                        <a:fillRef idx="0">
-                          <a:scrgbClr r="0" g="0" b="0"/>
-                        </a:fillRef>
-                        <a:effectRef idx="0">
-                          <a:scrgbClr r="0" g="0" b="0"/>
-                        </a:effectRef>
-                        <a:fontRef idx="minor">
-                          <a:schemeClr val="dk1"/>
-                        </a:fontRef>
-                      </wps:style>
-                      <wps:txbx>
-                        <w:txbxContent>
-                          <w:p>
-                            <w:pPr>
-                              <w:jc w:val="center"/>
-                              <w:rPr>
-                                <w:lang w:val="en-GB"/>
-                              </w:rPr>
-                            </w:pPr>
-                            <w:r>
-                              <w:rPr>
-                                <w:lang w:val="en-GB"/>
-                              </w:rPr>
-                              <w:t xml:space="preserve">5. </w:t>
-                            </w:r>
-                            <w:r>
-                              <w:rPr>
-                                <w:lang w:val="en-GB"/>
-                              </w:rPr>
-                              <w:t>V</w:t>
-                            </w:r>
-                            <w:r>
-                              <w:rPr>
-                                <w:lang w:val="en-GB"/>
-                              </w:rPr>
-                              <w:t>isualization of the coordinates</w:t>
-                            </w:r>
-                          </w:p>
-                        </w:txbxContent>
-                      </wps:txbx>
-                      <wps:bodyPr rot="0" spcFirstLastPara="0" vertOverflow="overflow" horzOverflow="overflow" vert="horz" wrap="square" lIns="91440" tIns="45720" rIns="91440" bIns="45720" numCol="1" spcCol="0" rtlCol="0" fromWordArt="0" anchor="t" anchorCtr="0" forceAA="0" compatLnSpc="1">
-                        <a:prstTxWarp prst="textNoShape">
-                          <a:avLst/>
-                        </a:prstTxWarp>
-                        <a:noAutofit/>
-                      </wps:bodyPr>
-                    </wps:wsp>
-                  </a:graphicData>
-                </a:graphic>
-                <wp14:sizeRelH relativeFrom="margin">
-                  <wp14:pctWidth>0</wp14:pctWidth>
-                </wp14:sizeRelH>
-              </wp:anchor>
-            </w:drawing>
-          </mc:Choice>
-          <mc:Fallback>
-            <w:pict>
-              <v:shape w14:anchorId="137D975D" id="Text Box 6" o:spid="_x0000_s1033" type="#_x0000_t202" style="position:absolute;margin-left:300.3pt;margin-top:226.85pt;width:204.15pt;height:25.4pt;z-index:251664384;visibility:visible;mso-wrap-style:square;mso-width-percent:0;mso-wrap-distance-left:9pt;mso-wrap-distance-top:0;mso-wrap-distance-right:9pt;mso-wrap-distance-bottom:0;mso-position-horizontal:absolute;mso-position-horizontal-relative:text;mso-position-vertical:absolute;mso-position-vertical-relative:text;mso-width-percent:0;mso-width-relative:margin;v-text-anchor:top" o:gfxdata="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" filled="f" strokecolor="white [3212]">
-                <v:stroke joinstyle="round"/>
-                <v:textbox>
-                  <w:txbxContent>
-                    <w:p>
-                      <w:pPr>
-                        <w:jc w:val="center"/>
-                        <w:rPr>
-                          <w:lang w:val="en-GB"/>
-                        </w:rPr>
-                      </w:pPr>
-                      <w:r>
-                        <w:rPr>
-                          <w:lang w:val="en-GB"/>
-                        </w:rPr>
-                        <w:t xml:space="preserve">5. </w:t>
-                      </w:r>
-                      <w:r>
-                        <w:rPr>
-                          <w:lang w:val="en-GB"/>
-                        </w:rPr>
-                        <w:t>V</w:t>
-                      </w:r>
-                      <w:r>
-                        <w:rPr>
-                          <w:lang w:val="en-GB"/>
-                        </w:rPr>
-                        <w:t>isualization of the coordinates</w:t>
-                      </w:r>
-                    </w:p>
-                  </w:txbxContent>
-                </v:textbox>
-              </v:shape>
-            </w:pict>
-          </mc:Fallback>
-        </mc:AlternateContent>
-      </w:r>
-      <w:r>
-        <w:rPr>
-          <w:rFonts w:ascii="Arial" w:hAnsi="Arial" w:cs="Arial"/>
-          <w:noProof/>
-          <w:sz w:val="24"/>
-          <w:szCs w:val="24"/>
-          <w:lang w:val="en-GB"/>
-        </w:rPr>
-        <w:drawing>
-          <wp:anchor distT="0" distB="0" distL="114300" distR="114300" simplePos="0" relativeHeight="251660288" behindDoc="0" locked="0" layoutInCell="1" allowOverlap="1" wp14:anchorId="544318AC" wp14:editId="427D3E2D">
-            <wp:simplePos x="0" y="0"/>
-            <wp:positionH relativeFrom="column">
-              <wp:posOffset>3562135</wp:posOffset>
-            </wp:positionH>
-            <wp:positionV relativeFrom="paragraph">
-              <wp:posOffset>607060</wp:posOffset>
-            </wp:positionV>
-            <wp:extent cx="2988945" cy="2172970"/>
-            <wp:effectExtent l="0" t="0" r="1905" b="0"/>
-            <wp:wrapTopAndBottom/>
-            <wp:docPr id="646540549" name="Picture 9"/>
-            <wp:cNvGraphicFramePr>
-              <a:graphicFrameLocks xmlns:a="http://schemas.openxmlformats.org/drawingml/2006/main" noChangeAspect="1"/>
-            </wp:cNvGraphicFramePr>
-            <a:graphic xmlns:a="http://schemas.openxmlformats.org/drawingml/2006/main">
-              <a:graphicData uri="http://schemas.openxmlformats.org/drawingml/2006/picture">
-                <pic:pic xmlns:pic="http://schemas.openxmlformats.org/drawingml/2006/picture">
-                  <pic:nvPicPr>
-                    <pic:cNvPr id="0" name="Picture 10"/>
-                    <pic:cNvPicPr>
-                      <a:picLocks noChangeAspect="1" noChangeArrowheads="1"/>
-                    </pic:cNvPicPr>
-                  </pic:nvPicPr>
-                  <pic:blipFill>
-                    <a:blip r:embed="rId17" cstate="print">
-                      <a:extLst>
-                        <a:ext uri="{28A0092B-C50C-407E-A947-70E740481C1C}">
-                          <a14:useLocalDpi xmlns:a14="http://schemas.microsoft.com/office/drawing/2010/main" val="0"/>
-                        </a:ext>
-                      </a:extLst>
-                    </a:blip>
-                    <a:srcRect/>
-                    <a:stretch>
-                      <a:fillRect/>
-                    </a:stretch>
-                  </pic:blipFill>
-                  <pic:spPr bwMode="auto">
-                    <a:xfrm>
-                      <a:off x="0" y="0"/>
-                      <a:ext cx="2988945" cy="2172970"/>
-                    </a:xfrm>
-                    <a:prstGeom prst="rect">
-                      <a:avLst/>
-                    </a:prstGeom>
-                    <a:noFill/>
-                    <a:ln>
-                      <a:noFill/>
-                    </a:ln>
-                  </pic:spPr>
-                </pic:pic>
-              </a:graphicData>
-            </a:graphic>
-            <wp14:sizeRelH relativeFrom="margin">
-              <wp14:pctWidth>0</wp14:pctWidth>
-            </wp14:sizeRelH>
-            <wp14:sizeRelV relativeFrom="margin">
-              <wp14:pctHeight>0</wp14:pctHeight>
-            </wp14:sizeRelV>
-          </wp:anchor>
-        </w:drawing>
-      </w:r>
-      <w:r>
-        <w:rPr>
-          <w:noProof/>
-        </w:rPr>
-        <mc:AlternateContent>
-          <mc:Choice Requires="wps">
-            <w:drawing>
-              <wp:anchor distT="0" distB="0" distL="114300" distR="114300" simplePos="0" relativeHeight="251662336" behindDoc="0" locked="0" layoutInCell="1" allowOverlap="1" wp14:anchorId="5F62D8AD" wp14:editId="0076A3B7">
-                <wp:simplePos x="0" y="0"/>
-                <wp:positionH relativeFrom="column">
-                  <wp:posOffset>39823</wp:posOffset>
-                </wp:positionH>
-                <wp:positionV relativeFrom="paragraph">
-                  <wp:posOffset>2898280</wp:posOffset>
-                </wp:positionV>
-                <wp:extent cx="2592682" cy="322301"/>
-                <wp:effectExtent l="0" t="0" r="17780" b="20955"/>
-                <wp:wrapNone/>
-                <wp:docPr id="1550352489" name="Text Box 6"/>
-                <wp:cNvGraphicFramePr/>
-                <a:graphic xmlns:a="http://schemas.openxmlformats.org/drawingml/2006/main">
-                  <a:graphicData uri="http://schemas.microsoft.com/office/word/2010/wordprocessingShape">
-                    <wps:wsp>
-                      <wps:cNvSpPr txBox="1"/>
-                      <wps:spPr>
-                        <a:xfrm>
-                          <a:off x="0" y="0"/>
-                          <a:ext cx="2592682" cy="322301"/>
-                        </a:xfrm>
-                        <a:prstGeom prst="rect">
-                          <a:avLst/>
-                        </a:prstGeom>
-                        <a:noFill/>
-                        <a:ln w="9525" cap="flat" cmpd="sng" algn="ctr">
-                          <a:solidFill>
-                            <a:schemeClr val="bg1"/>
-                          </a:solidFill>
-                          <a:prstDash val="solid"/>
-                          <a:round/>
-                          <a:headEnd type="none" w="med" len="med"/>
-                          <a:tailEnd type="none" w="med" len="med"/>
-                        </a:ln>
-                      </wps:spPr>
-                      <wps:style>
-                        <a:lnRef idx="0">
-                          <a:scrgbClr r="0" g="0" b="0"/>
-                        </a:lnRef>
-                        <a:fillRef idx="0">
-                          <a:scrgbClr r="0" g="0" b="0"/>
-                        </a:fillRef>
-                        <a:effectRef idx="0">
-                          <a:scrgbClr r="0" g="0" b="0"/>
-                        </a:effectRef>
-                        <a:fontRef idx="minor">
-                          <a:schemeClr val="dk1"/>
-                        </a:fontRef>
-                      </wps:style>
-                      <wps:txbx>
-                        <w:txbxContent>
-                          <w:p>
-                            <w:pPr>
-                              <w:jc w:val="center"/>
-                              <w:rPr>
-                                <w:lang w:val="en-GB"/>
-                              </w:rPr>
-                            </w:pPr>
-                            <w:r>
-                              <w:rPr>
-                                <w:lang w:val="en-GB"/>
-                              </w:rPr>
-                              <w:t xml:space="preserve">4. </w:t>
-                            </w:r>
-                            <w:r>
-                              <w:rPr>
-                                <w:lang w:val="en-GB"/>
-                              </w:rPr>
-                              <w:t>S</w:t>
-                            </w:r>
-                            <w:r>
-                              <w:rPr>
-                                <w:lang w:val="en-GB"/>
-                              </w:rPr>
-                              <w:t>keletonize</w:t>
-                            </w:r>
-                            <w:r>
-                              <w:rPr>
-                                <w:lang w:val="en-GB"/>
-                              </w:rPr>
-                              <w:t>d</w:t>
-                            </w:r>
-                            <w:r>
-                              <w:rPr>
-                                <w:lang w:val="en-GB"/>
-                              </w:rPr>
-                              <w:t xml:space="preserve"> version of the images</w:t>
-                            </w:r>
-                          </w:p>
-                        </w:txbxContent>
-                      </wps:txbx>
-                      <wps:bodyPr rot="0" spcFirstLastPara="0" vertOverflow="overflow" horzOverflow="overflow" vert="horz" wrap="square" lIns="91440" tIns="45720" rIns="91440" bIns="45720" numCol="1" spcCol="0" rtlCol="0" fromWordArt="0" anchor="t" anchorCtr="0" forceAA="0" compatLnSpc="1">
-                        <a:prstTxWarp prst="textNoShape">
-                          <a:avLst/>
-                        </a:prstTxWarp>
-                        <a:noAutofit/>
-                      </wps:bodyPr>
-                    </wps:wsp>
-                  </a:graphicData>
-                </a:graphic>
-                <wp14:sizeRelH relativeFrom="margin">
-                  <wp14:pctWidth>0</wp14:pctWidth>
-                </wp14:sizeRelH>
-              </wp:anchor>
-            </w:drawing>
-          </mc:Choice>
-          <mc:Fallback>
-            <w:pict>
-              <v:shape w14:anchorId="5F62D8AD" id="_x0000_s1034" type="#_x0000_t202" style="position:absolute;margin-left:3.15pt;margin-top:228.2pt;width:204.15pt;height:25.4pt;z-index:251662336;visibility:visible;mso-wrap-style:square;mso-width-percent:0;mso-wrap-distance-left:9pt;mso-wrap-distance-top:0;mso-wrap-distance-right:9pt;mso-wrap-distance-bottom:0;mso-position-horizontal:absolute;mso-position-horizontal-relative:text;mso-position-vertical:absolute;mso-position-vertical-relative:text;mso-width-percent:0;mso-width-relative:margin;v-text-anchor:top" o:gfxdata="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" filled="f" strokecolor="white [3212]">
-                <v:stroke joinstyle="round"/>
-                <v:textbox>
-                  <w:txbxContent>
-                    <w:p>
-                      <w:pPr>
-                        <w:jc w:val="center"/>
-                        <w:rPr>
-                          <w:lang w:val="en-GB"/>
-                        </w:rPr>
-                      </w:pPr>
-                      <w:r>
-                        <w:rPr>
-                          <w:lang w:val="en-GB"/>
-                        </w:rPr>
-                        <w:t xml:space="preserve">4. </w:t>
-                      </w:r>
-                      <w:r>
-                        <w:rPr>
-                          <w:lang w:val="en-GB"/>
-                        </w:rPr>
-                        <w:t>S</w:t>
-                      </w:r>
-                      <w:r>
-                        <w:rPr>
-                          <w:lang w:val="en-GB"/>
-                        </w:rPr>
-                        <w:t>keletonize</w:t>
-                      </w:r>
-                      <w:r>
-                        <w:rPr>
-                          <w:lang w:val="en-GB"/>
-                        </w:rPr>
-                        <w:t>d</w:t>
-                      </w:r>
-                      <w:r>
-                        <w:rPr>
-                          <w:lang w:val="en-GB"/>
-                        </w:rPr>
-                        <w:t xml:space="preserve"> version of the images</w:t>
-                      </w:r>
-                    </w:p>
-                  </w:txbxContent>
-                </v:textbox>
-              </v:shape>
-            </w:pict>
-          </mc:Fallback>
-        </mc:AlternateContent>
-      </w:r>
-      <w:r>
-        <w:rPr>
-          <w:rFonts w:ascii="Arial" w:hAnsi="Arial" w:cs="Arial"/>
-          <w:noProof/>
-          <w:sz w:val="24"/>
-          <w:szCs w:val="24"/>
-          <w:lang w:val="en-GB"/>
-        </w:rPr>
-        <w:drawing>
-          <wp:anchor distT="0" distB="0" distL="114300" distR="114300" simplePos="0" relativeHeight="251659264" behindDoc="0" locked="0" layoutInCell="1" allowOverlap="1" wp14:anchorId="23F25F50" wp14:editId="3E98009E">
-            <wp:simplePos x="0" y="0"/>
-            <wp:positionH relativeFrom="column">
-              <wp:posOffset>-213995</wp:posOffset>
-            </wp:positionH>
-            <wp:positionV relativeFrom="paragraph">
-              <wp:posOffset>607060</wp:posOffset>
-            </wp:positionV>
-            <wp:extent cx="3051810" cy="2190115"/>
-            <wp:effectExtent l="0" t="0" r="0" b="635"/>
-            <wp:wrapTopAndBottom/>
-            <wp:docPr id="2046132972" name="Picture 8"/>
-            <wp:cNvGraphicFramePr>
-              <a:graphicFrameLocks xmlns:a="http://schemas.openxmlformats.org/drawingml/2006/main" noChangeAspect="1"/>
-            </wp:cNvGraphicFramePr>
-            <a:graphic xmlns:a="http://schemas.openxmlformats.org/drawingml/2006/main">
-              <a:graphicData uri="http://schemas.openxmlformats.org/drawingml/2006/picture">
-                <pic:pic xmlns:pic="http://schemas.openxmlformats.org/drawingml/2006/picture">
-                  <pic:nvPicPr>
-                    <pic:cNvPr id="0" name="Picture 9"/>
-                    <pic:cNvPicPr>
-                      <a:picLocks noChangeAspect="1" noChangeArrowheads="1"/>
-                    </pic:cNvPicPr>
-                  </pic:nvPicPr>
-                  <pic:blipFill>
-                    <a:blip r:embed="rId18">
-                      <a:extLst>
-                        <a:ext uri="{28A0092B-C50C-407E-A947-70E740481C1C}">
-                          <a14:useLocalDpi xmlns:a14="http://schemas.microsoft.com/office/drawing/2010/main" val="0"/>
-                        </a:ext>
-                      </a:extLst>
-                    </a:blip>
-                    <a:srcRect/>
-                    <a:stretch>
-                      <a:fillRect/>
-                    </a:stretch>
-                  </pic:blipFill>
-                  <pic:spPr bwMode="auto">
-                    <a:xfrm>
-                      <a:off x="0" y="0"/>
-                      <a:ext cx="3051810" cy="2190115"/>
-                    </a:xfrm>
-                    <a:prstGeom prst="rect">
-                      <a:avLst/>
-                    </a:prstGeom>
-                    <a:noFill/>
-                    <a:ln>
-                      <a:noFill/>
-                    </a:ln>
-                  </pic:spPr>
-                </pic:pic>
-              </a:graphicData>
-            </a:graphic>
-            <wp14:sizeRelH relativeFrom="margin">
-              <wp14:pctWidth>0</wp14:pctWidth>
-            </wp14:sizeRelH>
-            <wp14:sizeRelV relativeFrom="margin">
-              <wp14:pctHeight>0</wp14:pctHeight>
-            </wp14:sizeRelV>
-          </wp:anchor>
-        </w:drawing>
-      </w:r>
-      <w:r>
-        <w:rPr>
-          <w:rFonts w:ascii="Arial" w:hAnsi="Arial" w:cs="Arial"/>
-          <w:sz w:val="24"/>
-          <w:szCs w:val="24"/>
-          <w:lang w:val="en-GB"/>
-        </w:rPr>
-        <w:t xml:space="preserve">With the </w:t>
-      </w:r>
-      <w:r>
-        <w:rPr>
-          <w:rFonts w:ascii="Arial" w:hAnsi="Arial" w:cs="Arial"/>
-          <w:sz w:val="24"/>
-          <w:szCs w:val="24"/>
-          <w:lang w:val="en-GB"/>
-        </w:rPr>
-        <w:t>roots isolated I was able to</w:t>
-      </w:r>
-      <w:r>
-        <w:rPr>
-          <w:rFonts w:ascii="Arial" w:hAnsi="Arial" w:cs="Arial"/>
-          <w:sz w:val="24"/>
-          <w:szCs w:val="24"/>
-          <w:lang w:val="en-GB"/>
-        </w:rPr>
-        <w:t xml:space="preserve"> </w:t>
-      </w:r>
-      <w:proofErr w:type="gramStart"/>
-      <w:r>
-        <w:rPr>
-          <w:rFonts w:ascii="Arial" w:hAnsi="Arial" w:cs="Arial"/>
-          <w:sz w:val="24"/>
-          <w:szCs w:val="24"/>
-        </w:rPr>
-        <w:t>skeletonize</w:t>
-      </w:r>
-      <w:r>
-        <w:rPr>
-          <w:rFonts w:ascii="Arial" w:hAnsi="Arial" w:cs="Arial"/>
-          <w:sz w:val="24"/>
-          <w:szCs w:val="24"/>
-        </w:rPr>
-        <w:t>(</w:t>
-      </w:r>
-      <w:proofErr w:type="gramEnd"/>
-      <w:r>
-        <w:rPr>
-          <w:rFonts w:ascii="Arial" w:hAnsi="Arial" w:cs="Arial"/>
-          <w:sz w:val="24"/>
-          <w:szCs w:val="24"/>
-        </w:rPr>
-        <w:t>4.)</w:t>
-      </w:r>
-      <w:r>
-        <w:rPr>
-          <w:rFonts w:ascii="Arial" w:hAnsi="Arial" w:cs="Arial"/>
-          <w:sz w:val="24"/>
-          <w:szCs w:val="24"/>
-        </w:rPr>
-        <w:t xml:space="preserve"> the image which turns everything in the image into a line or a skeleton of the image, with this I could</w:t>
-      </w:r>
-      <w:r>
-        <w:rPr>
-          <w:rFonts w:ascii="Arial" w:hAnsi="Arial" w:cs="Arial"/>
-          <w:sz w:val="24"/>
-          <w:szCs w:val="24"/>
-          <w:lang w:val="en-GB"/>
-        </w:rPr>
-        <w:t xml:space="preserve"> find all the coordinates </w:t>
-      </w:r>
-      <w:r>
-        <w:rPr>
-          <w:rFonts w:ascii="Arial" w:hAnsi="Arial" w:cs="Arial"/>
-          <w:sz w:val="24"/>
-          <w:szCs w:val="24"/>
-          <w:lang w:val="en-GB"/>
-        </w:rPr>
-        <w:t xml:space="preserve">of the beginning and end of every </w:t>
-      </w:r>
-      <w:proofErr w:type="gramStart"/>
-      <w:r>
-        <w:rPr>
-          <w:rFonts w:ascii="Arial" w:hAnsi="Arial" w:cs="Arial"/>
-          <w:sz w:val="24"/>
-          <w:szCs w:val="24"/>
-          <w:lang w:val="en-GB"/>
-        </w:rPr>
-        <w:t>root</w:t>
-      </w:r>
-      <w:r>
-        <w:rPr>
-          <w:rFonts w:ascii="Arial" w:hAnsi="Arial" w:cs="Arial"/>
-          <w:sz w:val="24"/>
-          <w:szCs w:val="24"/>
-          <w:lang w:val="en-GB"/>
-        </w:rPr>
-        <w:t>(</w:t>
-      </w:r>
-      <w:proofErr w:type="gramEnd"/>
-      <w:r>
-        <w:rPr>
-          <w:rFonts w:ascii="Arial" w:hAnsi="Arial" w:cs="Arial"/>
-          <w:sz w:val="24"/>
-          <w:szCs w:val="24"/>
-          <w:lang w:val="en-GB"/>
-        </w:rPr>
-        <w:t>5.)</w:t>
-      </w:r>
-      <w:r>
-        <w:rPr>
-          <w:rFonts w:ascii="Arial" w:hAnsi="Arial" w:cs="Arial"/>
-          <w:sz w:val="24"/>
-          <w:szCs w:val="24"/>
-          <w:lang w:val="en-GB"/>
-        </w:rPr>
-        <w:t>.</w:t>
-      </w:r>
-      <w:r>
-        <w:rPr>
-          <w:noProof/>
-        </w:rPr>
-        <w:t xml:space="preserve"> </w:t>
-      </w:r>
-      <w:r>
-        <w:rPr>
-          <w:noProof/>
-          <w:sz w:val="24"/>
-          <w:szCs w:val="24"/>
-        </w:rPr>
-        <w:t>after this I isolated the roots</w:t>
-      </w:r>
-      <w:r>
-        <w:rPr>
-          <w:noProof/>
-          <w:sz w:val="24"/>
-          <w:szCs w:val="24"/>
-        </w:rPr>
-        <w:t>(6.)</w:t>
-      </w:r>
-      <w:r>
-        <w:rPr>
-          <w:noProof/>
-          <w:sz w:val="24"/>
-          <w:szCs w:val="24"/>
-        </w:rPr>
-        <w:t xml:space="preserve"> and got </w:t>
-      </w:r>
-      <w:r>
-        <w:rPr>
-          <w:noProof/>
-          <w:sz w:val="24"/>
-          <w:szCs w:val="24"/>
-        </w:rPr>
-        <w:t>the</w:t>
-      </w:r>
-      <w:r>
-        <w:rPr>
-          <w:noProof/>
-          <w:sz w:val="24"/>
-          <w:szCs w:val="24"/>
-        </w:rPr>
-        <w:t xml:space="preserve"> length from the m</w:t>
-      </w:r>
-      <w:r>
-        <w:rPr>
-          <w:noProof/>
-          <w:sz w:val="24"/>
-          <w:szCs w:val="24"/>
-        </w:rPr>
-        <w:t>ain</w:t>
-      </w:r>
-      <w:r>
-        <w:rPr>
-          <w:noProof/>
-          <w:sz w:val="24"/>
-          <w:szCs w:val="24"/>
-        </w:rPr>
-        <w:t xml:space="preserve"> root</w:t>
-      </w:r>
-      <w:r>
-        <w:rPr>
-          <w:noProof/>
-          <w:sz w:val="24"/>
-          <w:szCs w:val="24"/>
-        </w:rPr>
-        <w:t>(7.)</w:t>
-      </w:r>
-      <w:r>
-        <w:rPr>
-          <w:noProof/>
-          <w:sz w:val="24"/>
-          <w:szCs w:val="24"/>
-        </w:rPr>
-        <w:t>.</w:t>
+          <w:rFonts w:ascii="Times New Roman" w:eastAsia="Times New Roman" w:hAnsi="Times New Roman" w:cs="Times New Roman"/>
+          <w:kern w:val="0"/>
+          <w:sz w:val="24"/>
+          <w:szCs w:val="24"/>
+          <w:lang w:eastAsia="en-GB"/>
+          <w14:ligatures w14:val="none"/>
+        </w:rPr>
+        <w:t>Designed a hybrid branching strategy (institutional forking model + Git-Flow/GitHub-Flow) letting partner institutions work independently while keeping merge control centralized</w:t>
       </w:r>
     </w:p>
     <w:p>
       <w:pPr>
-        <w:tabs>
-          <w:tab w:val="center" w:pos="4513"/>
-        </w:tabs>
-        <w:rPr>
-          <w:noProof/>
-          <w:sz w:val="24"/>
-          <w:szCs w:val="24"/>
-        </w:rPr>
-      </w:pPr>
-    </w:p>
-    <w:p>
-      <w:pPr>
-        <w:tabs>
-          <w:tab w:val="center" w:pos="4513"/>
-        </w:tabs>
-        <w:rPr>
-          <w:noProof/>
-          <w:sz w:val="24"/>
-          <w:szCs w:val="24"/>
+        <w:numPr>
+          <w:ilvl w:val="0"/>
+          <w:numId w:val="2"/>
+        </w:numPr>
+        <w:spacing w:before="100" w:beforeAutospacing="1" w:after="100" w:afterAutospacing="1" w:line="240" w:lineRule="auto"/>
+        <w:rPr>
+          <w:rFonts w:ascii="Times New Roman" w:eastAsia="Times New Roman" w:hAnsi="Times New Roman" w:cs="Times New Roman"/>
+          <w:kern w:val="0"/>
+          <w:sz w:val="24"/>
+          <w:szCs w:val="24"/>
+          <w:lang w:eastAsia="en-GB"/>
+          <w14:ligatures w14:val="none"/>
         </w:rPr>
       </w:pPr>
       <w:r>
         <w:rPr>
-          <w:noProof/>
-          <w:sz w:val="24"/>
-          <w:szCs w:val="24"/>
-        </w:rPr>
-        <w:drawing>
-          <wp:anchor distT="0" distB="0" distL="114300" distR="114300" simplePos="0" relativeHeight="251666432" behindDoc="0" locked="0" layoutInCell="1" allowOverlap="1" wp14:anchorId="283613DE" wp14:editId="4BED6543">
-            <wp:simplePos x="0" y="0"/>
-            <wp:positionH relativeFrom="margin">
-              <wp:posOffset>3245543</wp:posOffset>
-            </wp:positionH>
-            <wp:positionV relativeFrom="paragraph">
-              <wp:posOffset>443808</wp:posOffset>
-            </wp:positionV>
-            <wp:extent cx="3481070" cy="1911350"/>
-            <wp:effectExtent l="0" t="0" r="5080" b="0"/>
-            <wp:wrapTopAndBottom/>
-            <wp:docPr id="324421286" name="Picture 12"/>
-            <wp:cNvGraphicFramePr>
-              <a:graphicFrameLocks xmlns:a="http://schemas.openxmlformats.org/drawingml/2006/main" noChangeAspect="1"/>
-            </wp:cNvGraphicFramePr>
-            <a:graphic xmlns:a="http://schemas.openxmlformats.org/drawingml/2006/main">
-              <a:graphicData uri="http://schemas.openxmlformats.org/drawingml/2006/picture">
-                <pic:pic xmlns:pic="http://schemas.openxmlformats.org/drawingml/2006/picture">
-                  <pic:nvPicPr>
-                    <pic:cNvPr id="0" name="Picture 13"/>
-                    <pic:cNvPicPr>
-                      <a:picLocks noChangeAspect="1" noChangeArrowheads="1"/>
-                    </pic:cNvPicPr>
-                  </pic:nvPicPr>
-                  <pic:blipFill>
-                    <a:blip r:embed="rId19">
-                      <a:extLst>
-                        <a:ext uri="{28A0092B-C50C-407E-A947-70E740481C1C}">
-                          <a14:useLocalDpi xmlns:a14="http://schemas.microsoft.com/office/drawing/2010/main" val="0"/>
-                        </a:ext>
-                      </a:extLst>
-                    </a:blip>
-                    <a:srcRect/>
-                    <a:stretch>
-                      <a:fillRect/>
-                    </a:stretch>
-                  </pic:blipFill>
-                  <pic:spPr bwMode="auto">
-                    <a:xfrm>
-                      <a:off x="0" y="0"/>
-                      <a:ext cx="3481070" cy="1911350"/>
-                    </a:xfrm>
-                    <a:prstGeom prst="rect">
-                      <a:avLst/>
-                    </a:prstGeom>
-                    <a:noFill/>
-                    <a:ln>
-                      <a:noFill/>
-                    </a:ln>
-                  </pic:spPr>
-                </pic:pic>
-              </a:graphicData>
-            </a:graphic>
-            <wp14:sizeRelH relativeFrom="margin">
-              <wp14:pctWidth>0</wp14:pctWidth>
-            </wp14:sizeRelH>
-            <wp14:sizeRelV relativeFrom="margin">
-              <wp14:pctHeight>0</wp14:pctHeight>
-            </wp14:sizeRelV>
-          </wp:anchor>
-        </w:drawing>
-      </w:r>
-      <w:r>
-        <w:rPr>
-          <w:noProof/>
-          <w:sz w:val="24"/>
-          <w:szCs w:val="24"/>
-        </w:rPr>
-        <w:drawing>
-          <wp:anchor distT="0" distB="0" distL="114300" distR="114300" simplePos="0" relativeHeight="251665408" behindDoc="0" locked="0" layoutInCell="1" allowOverlap="1" wp14:anchorId="5D36D730" wp14:editId="3C0A643D">
-            <wp:simplePos x="0" y="0"/>
-            <wp:positionH relativeFrom="column">
-              <wp:posOffset>-223520</wp:posOffset>
-            </wp:positionH>
-            <wp:positionV relativeFrom="paragraph">
-              <wp:posOffset>297180</wp:posOffset>
-            </wp:positionV>
-            <wp:extent cx="3227705" cy="2252980"/>
-            <wp:effectExtent l="0" t="0" r="0" b="0"/>
-            <wp:wrapTopAndBottom/>
-            <wp:docPr id="160136159" name="Picture 11"/>
-            <wp:cNvGraphicFramePr>
-              <a:graphicFrameLocks xmlns:a="http://schemas.openxmlformats.org/drawingml/2006/main" noChangeAspect="1"/>
-            </wp:cNvGraphicFramePr>
-            <a:graphic xmlns:a="http://schemas.openxmlformats.org/drawingml/2006/main">
-              <a:graphicData uri="http://schemas.openxmlformats.org/drawingml/2006/picture">
-                <pic:pic xmlns:pic="http://schemas.openxmlformats.org/drawingml/2006/picture">
-                  <pic:nvPicPr>
-                    <pic:cNvPr id="0" name="Picture 12"/>
-                    <pic:cNvPicPr>
-                      <a:picLocks noChangeAspect="1" noChangeArrowheads="1"/>
-                    </pic:cNvPicPr>
-                  </pic:nvPicPr>
-                  <pic:blipFill rotWithShape="1">
-                    <a:blip r:embed="rId20">
-                      <a:extLst>
-                        <a:ext uri="{28A0092B-C50C-407E-A947-70E740481C1C}">
-                          <a14:useLocalDpi xmlns:a14="http://schemas.microsoft.com/office/drawing/2010/main" val="0"/>
-                        </a:ext>
-                      </a:extLst>
-                    </a:blip>
-                    <a:srcRect b="1394"/>
-                    <a:stretch/>
-                  </pic:blipFill>
-                  <pic:spPr bwMode="auto">
-                    <a:xfrm>
-                      <a:off x="0" y="0"/>
-                      <a:ext cx="3227705" cy="2252980"/>
-                    </a:xfrm>
-                    <a:prstGeom prst="rect">
-                      <a:avLst/>
-                    </a:prstGeom>
-                    <a:noFill/>
-                    <a:ln>
-                      <a:noFill/>
-                    </a:ln>
-                    <a:extLst>
-                      <a:ext uri="{53640926-AAD7-44D8-BBD7-CCE9431645EC}">
-                        <a14:shadowObscured xmlns:a14="http://schemas.microsoft.com/office/drawing/2010/main"/>
-                      </a:ext>
-                    </a:extLst>
-                  </pic:spPr>
-                </pic:pic>
-              </a:graphicData>
-            </a:graphic>
-            <wp14:sizeRelH relativeFrom="margin">
-              <wp14:pctWidth>0</wp14:pctWidth>
-            </wp14:sizeRelH>
-            <wp14:sizeRelV relativeFrom="margin">
-              <wp14:pctHeight>0</wp14:pctHeight>
-            </wp14:sizeRelV>
-          </wp:anchor>
-        </w:drawing>
+          <w:rFonts w:ascii="Times New Roman" w:eastAsia="Times New Roman" w:hAnsi="Times New Roman" w:cs="Times New Roman"/>
+          <w:kern w:val="0"/>
+          <w:sz w:val="24"/>
+          <w:szCs w:val="24"/>
+          <w:lang w:eastAsia="en-GB"/>
+          <w14:ligatures w14:val="none"/>
+        </w:rPr>
+        <w:t>Containerized the toolkit into a 5-service Docker stack (frontend, backend, data pipeline, inference, SFTP) and built a CI/CD pipeline that detects the changed service on each merge and rebuilds/redeploys only that container via a self-hosted GitHub Actions runner</w:t>
       </w:r>
     </w:p>
     <w:p>
       <w:pPr>
-        <w:tabs>
-          <w:tab w:val="center" w:pos="4513"/>
-        </w:tabs>
-        <w:rPr>
-          <w:noProof/>
-          <w:sz w:val="24"/>
-          <w:szCs w:val="24"/>
+        <w:numPr>
+          <w:ilvl w:val="0"/>
+          <w:numId w:val="2"/>
+        </w:numPr>
+        <w:spacing w:before="100" w:beforeAutospacing="1" w:after="100" w:afterAutospacing="1" w:line="240" w:lineRule="auto"/>
+        <w:rPr>
+          <w:rFonts w:ascii="Times New Roman" w:eastAsia="Times New Roman" w:hAnsi="Times New Roman" w:cs="Times New Roman"/>
+          <w:kern w:val="0"/>
+          <w:sz w:val="24"/>
+          <w:szCs w:val="24"/>
+          <w:lang w:eastAsia="en-GB"/>
+          <w14:ligatures w14:val="none"/>
         </w:rPr>
       </w:pPr>
       <w:r>
         <w:rPr>
-          <w:noProof/>
-        </w:rPr>
-        <mc:AlternateContent>
-          <mc:Choice Requires="wps">
-            <w:drawing>
-              <wp:anchor distT="0" distB="0" distL="114300" distR="114300" simplePos="0" relativeHeight="251670528" behindDoc="0" locked="0" layoutInCell="1" allowOverlap="1" wp14:anchorId="2D624747" wp14:editId="32D8911B">
-                <wp:simplePos x="0" y="0"/>
-                <wp:positionH relativeFrom="column">
-                  <wp:posOffset>3827335</wp:posOffset>
-                </wp:positionH>
-                <wp:positionV relativeFrom="paragraph">
-                  <wp:posOffset>2354060</wp:posOffset>
-                </wp:positionV>
-                <wp:extent cx="2592682" cy="322301"/>
-                <wp:effectExtent l="0" t="0" r="17780" b="20955"/>
-                <wp:wrapNone/>
-                <wp:docPr id="1860694926" name="Text Box 6"/>
-                <wp:cNvGraphicFramePr/>
-                <a:graphic xmlns:a="http://schemas.openxmlformats.org/drawingml/2006/main">
-                  <a:graphicData uri="http://schemas.microsoft.com/office/word/2010/wordprocessingShape">
-                    <wps:wsp>
-                      <wps:cNvSpPr txBox="1"/>
-                      <wps:spPr>
-                        <a:xfrm>
-                          <a:off x="0" y="0"/>
-                          <a:ext cx="2592682" cy="322301"/>
-                        </a:xfrm>
-                        <a:prstGeom prst="rect">
-                          <a:avLst/>
-                        </a:prstGeom>
-                        <a:noFill/>
-                        <a:ln w="9525" cap="flat" cmpd="sng" algn="ctr">
-                          <a:solidFill>
-                            <a:schemeClr val="bg1"/>
-                          </a:solidFill>
-                          <a:prstDash val="solid"/>
-                          <a:round/>
-                          <a:headEnd type="none" w="med" len="med"/>
-                          <a:tailEnd type="none" w="med" len="med"/>
-                        </a:ln>
-                      </wps:spPr>
-                      <wps:style>
-                        <a:lnRef idx="0">
-                          <a:scrgbClr r="0" g="0" b="0"/>
-                        </a:lnRef>
-                        <a:fillRef idx="0">
-                          <a:scrgbClr r="0" g="0" b="0"/>
-                        </a:fillRef>
-                        <a:effectRef idx="0">
-                          <a:scrgbClr r="0" g="0" b="0"/>
-                        </a:effectRef>
-                        <a:fontRef idx="minor">
-                          <a:schemeClr val="dk1"/>
-                        </a:fontRef>
-                      </wps:style>
-                      <wps:txbx>
-                        <w:txbxContent>
-                          <w:p>
-                            <w:pPr>
-                              <w:jc w:val="center"/>
-                              <w:rPr>
-                                <w:lang w:val="en-GB"/>
-                              </w:rPr>
-                            </w:pPr>
-                            <w:r>
-                              <w:rPr>
-                                <w:lang w:val="en-GB"/>
-                              </w:rPr>
-                              <w:t xml:space="preserve">7. </w:t>
-                            </w:r>
-                            <w:r>
-                              <w:rPr>
-                                <w:lang w:val="en-GB"/>
-                              </w:rPr>
-                              <w:t>R</w:t>
-                            </w:r>
-                            <w:r>
-                              <w:rPr>
-                                <w:lang w:val="en-GB"/>
-                              </w:rPr>
-                              <w:t>oot lengths</w:t>
-                            </w:r>
-                          </w:p>
-                        </w:txbxContent>
-                      </wps:txbx>
-                      <wps:bodyPr rot="0" spcFirstLastPara="0" vertOverflow="overflow" horzOverflow="overflow" vert="horz" wrap="square" lIns="91440" tIns="45720" rIns="91440" bIns="45720" numCol="1" spcCol="0" rtlCol="0" fromWordArt="0" anchor="t" anchorCtr="0" forceAA="0" compatLnSpc="1">
-                        <a:prstTxWarp prst="textNoShape">
-                          <a:avLst/>
-                        </a:prstTxWarp>
-                        <a:noAutofit/>
-                      </wps:bodyPr>
-                    </wps:wsp>
-                  </a:graphicData>
-                </a:graphic>
-                <wp14:sizeRelH relativeFrom="margin">
-                  <wp14:pctWidth>0</wp14:pctWidth>
-                </wp14:sizeRelH>
-              </wp:anchor>
-            </w:drawing>
-          </mc:Choice>
-          <mc:Fallback>
-            <w:pict>
-              <v:shape w14:anchorId="2D624747" id="_x0000_s1035" type="#_x0000_t202" style="position:absolute;margin-left:301.35pt;margin-top:185.35pt;width:204.15pt;height:25.4pt;z-index:251670528;visibility:visible;mso-wrap-style:square;mso-width-percent:0;mso-wrap-distance-left:9pt;mso-wrap-distance-top:0;mso-wrap-distance-right:9pt;mso-wrap-distance-bottom:0;mso-position-horizontal:absolute;mso-position-horizontal-relative:text;mso-position-vertical:absolute;mso-position-vertical-relative:text;mso-width-percent:0;mso-width-relative:margin;v-text-anchor:top" o:gfxdata="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" filled="f" strokecolor="white [3212]">
-                <v:stroke joinstyle="round"/>
-                <v:textbox>
-                  <w:txbxContent>
-                    <w:p>
-                      <w:pPr>
-                        <w:jc w:val="center"/>
-                        <w:rPr>
-                          <w:lang w:val="en-GB"/>
-                        </w:rPr>
-                      </w:pPr>
-                      <w:r>
-                        <w:rPr>
-                          <w:lang w:val="en-GB"/>
-                        </w:rPr>
-                        <w:t xml:space="preserve">7. </w:t>
-                      </w:r>
-                      <w:r>
-                        <w:rPr>
-                          <w:lang w:val="en-GB"/>
-                        </w:rPr>
-                        <w:t>R</w:t>
-                      </w:r>
-                      <w:r>
-                        <w:rPr>
-                          <w:lang w:val="en-GB"/>
-                        </w:rPr>
-                        <w:t>oot lengths</w:t>
-                      </w:r>
-                    </w:p>
-                  </w:txbxContent>
-                </v:textbox>
-              </v:shape>
-            </w:pict>
-          </mc:Fallback>
-        </mc:AlternateContent>
-      </w:r>
-      <w:r>
-        <w:rPr>
-          <w:noProof/>
-        </w:rPr>
-        <mc:AlternateContent>
-          <mc:Choice Requires="wps">
-            <w:drawing>
-              <wp:anchor distT="0" distB="0" distL="114300" distR="114300" simplePos="0" relativeHeight="251668480" behindDoc="0" locked="0" layoutInCell="1" allowOverlap="1" wp14:anchorId="4963EE9C" wp14:editId="26CC3E10">
-                <wp:simplePos x="0" y="0"/>
-                <wp:positionH relativeFrom="column">
-                  <wp:posOffset>27421</wp:posOffset>
-                </wp:positionH>
-                <wp:positionV relativeFrom="paragraph">
-                  <wp:posOffset>2371692</wp:posOffset>
-                </wp:positionV>
-                <wp:extent cx="2592682" cy="322301"/>
-                <wp:effectExtent l="0" t="0" r="17780" b="20955"/>
-                <wp:wrapNone/>
-                <wp:docPr id="1472766680" name="Text Box 6"/>
-                <wp:cNvGraphicFramePr/>
-                <a:graphic xmlns:a="http://schemas.openxmlformats.org/drawingml/2006/main">
-                  <a:graphicData uri="http://schemas.microsoft.com/office/word/2010/wordprocessingShape">
-                    <wps:wsp>
-                      <wps:cNvSpPr txBox="1"/>
-                      <wps:spPr>
-                        <a:xfrm>
-                          <a:off x="0" y="0"/>
-                          <a:ext cx="2592682" cy="322301"/>
-                        </a:xfrm>
-                        <a:prstGeom prst="rect">
-                          <a:avLst/>
-                        </a:prstGeom>
-                        <a:noFill/>
-                        <a:ln w="9525" cap="flat" cmpd="sng" algn="ctr">
-                          <a:solidFill>
-                            <a:schemeClr val="bg1"/>
-                          </a:solidFill>
-                          <a:prstDash val="solid"/>
-                          <a:round/>
-                          <a:headEnd type="none" w="med" len="med"/>
-                          <a:tailEnd type="none" w="med" len="med"/>
-                        </a:ln>
-                      </wps:spPr>
-                      <wps:style>
-                        <a:lnRef idx="0">
-                          <a:scrgbClr r="0" g="0" b="0"/>
-                        </a:lnRef>
-                        <a:fillRef idx="0">
-                          <a:scrgbClr r="0" g="0" b="0"/>
-                        </a:fillRef>
-                        <a:effectRef idx="0">
-                          <a:scrgbClr r="0" g="0" b="0"/>
-                        </a:effectRef>
-                        <a:fontRef idx="minor">
-                          <a:schemeClr val="dk1"/>
-                        </a:fontRef>
-                      </wps:style>
-                      <wps:txbx>
-                        <w:txbxContent>
-                          <w:p>
-                            <w:pPr>
-                              <w:jc w:val="center"/>
-                              <w:rPr>
-                                <w:lang w:val="en-GB"/>
-                              </w:rPr>
-                            </w:pPr>
-                            <w:r>
-                              <w:rPr>
-                                <w:lang w:val="en-GB"/>
-                              </w:rPr>
-                              <w:t>6. Isolated roots</w:t>
-                            </w:r>
-                          </w:p>
-                        </w:txbxContent>
-                      </wps:txbx>
-                      <wps:bodyPr rot="0" spcFirstLastPara="0" vertOverflow="overflow" horzOverflow="overflow" vert="horz" wrap="square" lIns="91440" tIns="45720" rIns="91440" bIns="45720" numCol="1" spcCol="0" rtlCol="0" fromWordArt="0" anchor="t" anchorCtr="0" forceAA="0" compatLnSpc="1">
-                        <a:prstTxWarp prst="textNoShape">
-                          <a:avLst/>
-                        </a:prstTxWarp>
-                        <a:noAutofit/>
-                      </wps:bodyPr>
-                    </wps:wsp>
-                  </a:graphicData>
-                </a:graphic>
-                <wp14:sizeRelH relativeFrom="margin">
-                  <wp14:pctWidth>0</wp14:pctWidth>
-                </wp14:sizeRelH>
-              </wp:anchor>
-            </w:drawing>
-          </mc:Choice>
-          <mc:Fallback>
-            <w:pict>
-              <v:shape w14:anchorId="4963EE9C" id="_x0000_s1036" type="#_x0000_t202" style="position:absolute;margin-left:2.15pt;margin-top:186.75pt;width:204.15pt;height:25.4pt;z-index:251668480;visibility:visible;mso-wrap-style:square;mso-width-percent:0;mso-wrap-distance-left:9pt;mso-wrap-distance-top:0;mso-wrap-distance-right:9pt;mso-wrap-distance-bottom:0;mso-position-horizontal:absolute;mso-position-horizontal-relative:text;mso-position-vertical:absolute;mso-position-vertical-relative:text;mso-width-percent:0;mso-width-relative:margin;v-text-anchor:top" o:gfxdata="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" filled="f" strokecolor="white [3212]">
-                <v:stroke joinstyle="round"/>
-                <v:textbox>
-                  <w:txbxContent>
-                    <w:p>
-                      <w:pPr>
-                        <w:jc w:val="center"/>
-                        <w:rPr>
-                          <w:lang w:val="en-GB"/>
-                        </w:rPr>
-                      </w:pPr>
-                      <w:r>
-                        <w:rPr>
-                          <w:lang w:val="en-GB"/>
-                        </w:rPr>
-                        <w:t>6. Isolated roots</w:t>
-                      </w:r>
-                    </w:p>
-                  </w:txbxContent>
-                </v:textbox>
-              </v:shape>
-            </w:pict>
-          </mc:Fallback>
-        </mc:AlternateContent>
+          <w:rFonts w:ascii="Times New Roman" w:eastAsia="Times New Roman" w:hAnsi="Times New Roman" w:cs="Times New Roman"/>
+          <w:kern w:val="0"/>
+          <w:sz w:val="24"/>
+          <w:szCs w:val="24"/>
+          <w:lang w:eastAsia="en-GB"/>
+          <w14:ligatures w14:val="none"/>
+        </w:rPr>
+        <w:t>Designed and ran a within-subjects usability study (n=4) using the Technology Acceptance Model, DORA, and SPACE frameworks, measuring a 2-4x reduction in deployment time (8-12 min vs. 22-33 min) and unanimous preference for the new workflow</w:t>
       </w:r>
     </w:p>
     <w:p>
       <w:pPr>
-        <w:tabs>
-          <w:tab w:val="center" w:pos="4513"/>
-        </w:tabs>
-        <w:rPr>
-          <w:noProof/>
-          <w:sz w:val="24"/>
-          <w:szCs w:val="24"/>
-        </w:rPr>
-      </w:pPr>
-    </w:p>
-    <w:p>
-      <w:pPr>
-        <w:tabs>
-          <w:tab w:val="center" w:pos="4513"/>
-        </w:tabs>
-        <w:rPr>
-          <w:rFonts w:ascii="Arial" w:hAnsi="Arial" w:cs="Arial"/>
-          <w:sz w:val="24"/>
-          <w:szCs w:val="24"/>
+        <w:numPr>
+          <w:ilvl w:val="0"/>
+          <w:numId w:val="2"/>
+        </w:numPr>
+        <w:spacing w:before="100" w:beforeAutospacing="1" w:after="100" w:afterAutospacing="1" w:line="240" w:lineRule="auto"/>
+        <w:rPr>
+          <w:rFonts w:ascii="Times New Roman" w:eastAsia="Times New Roman" w:hAnsi="Times New Roman" w:cs="Times New Roman"/>
+          <w:kern w:val="0"/>
+          <w:sz w:val="24"/>
+          <w:szCs w:val="24"/>
+          <w:lang w:eastAsia="en-GB"/>
+          <w14:ligatures w14:val="none"/>
         </w:rPr>
       </w:pPr>
       <w:r>
         <w:rPr>
-          <w:noProof/>
-        </w:rPr>
-        <mc:AlternateContent>
-          <mc:Choice Requires="wps">
-            <w:drawing>
-              <wp:anchor distT="0" distB="0" distL="114300" distR="114300" simplePos="0" relativeHeight="251673600" behindDoc="0" locked="0" layoutInCell="1" allowOverlap="1" wp14:anchorId="0304F911" wp14:editId="0AD15C17">
-                <wp:simplePos x="0" y="0"/>
-                <wp:positionH relativeFrom="column">
-                  <wp:posOffset>800252</wp:posOffset>
-                </wp:positionH>
-                <wp:positionV relativeFrom="paragraph">
-                  <wp:posOffset>3309620</wp:posOffset>
-                </wp:positionV>
-                <wp:extent cx="2592682" cy="322301"/>
-                <wp:effectExtent l="0" t="0" r="17780" b="20955"/>
-                <wp:wrapNone/>
-                <wp:docPr id="488433610" name="Text Box 6"/>
-                <wp:cNvGraphicFramePr/>
-                <a:graphic xmlns:a="http://schemas.openxmlformats.org/drawingml/2006/main">
-                  <a:graphicData uri="http://schemas.microsoft.com/office/word/2010/wordprocessingShape">
-                    <wps:wsp>
-                      <wps:cNvSpPr txBox="1"/>
-                      <wps:spPr>
-                        <a:xfrm>
-                          <a:off x="0" y="0"/>
-                          <a:ext cx="2592682" cy="322301"/>
-                        </a:xfrm>
-                        <a:prstGeom prst="rect">
-                          <a:avLst/>
-                        </a:prstGeom>
-                        <a:noFill/>
-                        <a:ln w="9525" cap="flat" cmpd="sng" algn="ctr">
-                          <a:solidFill>
-                            <a:schemeClr val="bg1"/>
-                          </a:solidFill>
-                          <a:prstDash val="solid"/>
-                          <a:round/>
-                          <a:headEnd type="none" w="med" len="med"/>
-                          <a:tailEnd type="none" w="med" len="med"/>
-                        </a:ln>
-                      </wps:spPr>
-                      <wps:style>
-                        <a:lnRef idx="0">
-                          <a:scrgbClr r="0" g="0" b="0"/>
-                        </a:lnRef>
-                        <a:fillRef idx="0">
-                          <a:scrgbClr r="0" g="0" b="0"/>
-                        </a:fillRef>
-                        <a:effectRef idx="0">
-                          <a:scrgbClr r="0" g="0" b="0"/>
-                        </a:effectRef>
-                        <a:fontRef idx="minor">
-                          <a:schemeClr val="dk1"/>
-                        </a:fontRef>
-                      </wps:style>
-                      <wps:txbx>
-                        <w:txbxContent>
-                          <w:p>
-                            <w:pPr>
-                              <w:jc w:val="center"/>
-                              <w:rPr>
-                                <w:lang w:val="en-GB"/>
-                              </w:rPr>
-                            </w:pPr>
-                            <w:r>
-                              <w:rPr>
-                                <w:lang w:val="en-GB"/>
-                              </w:rPr>
-                              <w:t>8. Simulation of robot moving</w:t>
-                            </w:r>
-                          </w:p>
-                        </w:txbxContent>
-                      </wps:txbx>
-                      <wps:bodyPr rot="0" spcFirstLastPara="0" vertOverflow="overflow" horzOverflow="overflow" vert="horz" wrap="square" lIns="91440" tIns="45720" rIns="91440" bIns="45720" numCol="1" spcCol="0" rtlCol="0" fromWordArt="0" anchor="t" anchorCtr="0" forceAA="0" compatLnSpc="1">
-                        <a:prstTxWarp prst="textNoShape">
-                          <a:avLst/>
-                        </a:prstTxWarp>
-                        <a:noAutofit/>
-                      </wps:bodyPr>
-                    </wps:wsp>
-                  </a:graphicData>
-                </a:graphic>
-                <wp14:sizeRelH relativeFrom="margin">
-                  <wp14:pctWidth>0</wp14:pctWidth>
-                </wp14:sizeRelH>
-              </wp:anchor>
-            </w:drawing>
-          </mc:Choice>
-          <mc:Fallback>
-            <w:pict>
-              <v:shape w14:anchorId="0304F911" id="_x0000_s1037" type="#_x0000_t202" style="position:absolute;margin-left:63pt;margin-top:260.6pt;width:204.15pt;height:25.4pt;z-index:251673600;visibility:visible;mso-wrap-style:square;mso-width-percent:0;mso-wrap-distance-left:9pt;mso-wrap-distance-top:0;mso-wrap-distance-right:9pt;mso-wrap-distance-bottom:0;mso-position-horizontal:absolute;mso-position-horizontal-relative:text;mso-position-vertical:absolute;mso-position-vertical-relative:text;mso-width-percent:0;mso-width-relative:margin;v-text-anchor:top" o:gfxdata="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" filled="f" strokecolor="white [3212]">
-                <v:stroke joinstyle="round"/>
-                <v:textbox>
-                  <w:txbxContent>
-                    <w:p>
-                      <w:pPr>
-                        <w:jc w:val="center"/>
-                        <w:rPr>
-                          <w:lang w:val="en-GB"/>
-                        </w:rPr>
-                      </w:pPr>
-                      <w:r>
-                        <w:rPr>
-                          <w:lang w:val="en-GB"/>
-                        </w:rPr>
-                        <w:t>8. Simulation of robot moving</w:t>
-                      </w:r>
-                    </w:p>
-                  </w:txbxContent>
-                </v:textbox>
-              </v:shape>
-            </w:pict>
-          </mc:Fallback>
-        </mc:AlternateContent>
-      </w:r>
-      <w:r>
-        <w:rPr>
-          <w:rFonts w:ascii="Arial" w:hAnsi="Arial" w:cs="Arial"/>
-          <w:noProof/>
-          <w:sz w:val="24"/>
-          <w:szCs w:val="24"/>
-        </w:rPr>
-        <w:drawing>
-          <wp:anchor distT="0" distB="0" distL="114300" distR="114300" simplePos="0" relativeHeight="251671552" behindDoc="0" locked="0" layoutInCell="1" allowOverlap="1" wp14:anchorId="61286FA1" wp14:editId="4249079B">
-            <wp:simplePos x="0" y="0"/>
-            <wp:positionH relativeFrom="column">
-              <wp:posOffset>-265904</wp:posOffset>
-            </wp:positionH>
-            <wp:positionV relativeFrom="paragraph">
-              <wp:posOffset>454547</wp:posOffset>
-            </wp:positionV>
-            <wp:extent cx="4878705" cy="2748280"/>
-            <wp:effectExtent l="0" t="0" r="0" b="0"/>
-            <wp:wrapTopAndBottom/>
-            <wp:docPr id="23" name="Picture 22" descr="A computer screen shot of a computer screen&#10;&#10;Description automatically generated">
-              <a:extLst xmlns:a="http://schemas.openxmlformats.org/drawingml/2006/main">
-                <a:ext uri="{FF2B5EF4-FFF2-40B4-BE49-F238E27FC236}">
-                  <a16:creationId xmlns:a16="http://schemas.microsoft.com/office/drawing/2014/main" id="{1F2E99B5-EC17-91AE-8A4A-EA0CC808FC74}"/>
-                </a:ext>
-              </a:extLst>
-            </wp:docPr>
-            <wp:cNvGraphicFramePr>
-              <a:graphicFrameLocks xmlns:a="http://schemas.openxmlformats.org/drawingml/2006/main" noChangeAspect="1"/>
-            </wp:cNvGraphicFramePr>
-            <a:graphic xmlns:a="http://schemas.openxmlformats.org/drawingml/2006/main">
-              <a:graphicData uri="http://schemas.openxmlformats.org/drawingml/2006/picture">
-                <pic:pic xmlns:pic="http://schemas.openxmlformats.org/drawingml/2006/picture">
-                  <pic:nvPicPr>
-                    <pic:cNvPr id="23" name="Picture 22" descr="A computer screen shot of a computer screen&#10;&#10;Description automatically generated">
-                      <a:extLst>
-                        <a:ext uri="{FF2B5EF4-FFF2-40B4-BE49-F238E27FC236}">
-                          <a16:creationId xmlns:a16="http://schemas.microsoft.com/office/drawing/2014/main" id="{1F2E99B5-EC17-91AE-8A4A-EA0CC808FC74}"/>
-                        </a:ext>
-                      </a:extLst>
-                    </pic:cNvPr>
-                    <pic:cNvPicPr>
-                      <a:picLocks noChangeAspect="1"/>
-                    </pic:cNvPicPr>
-                  </pic:nvPicPr>
-                  <pic:blipFill>
-                    <a:blip r:embed="rId21">
-                      <a:extLst>
-                        <a:ext uri="{28A0092B-C50C-407E-A947-70E740481C1C}">
-                          <a14:useLocalDpi xmlns:a14="http://schemas.microsoft.com/office/drawing/2010/main" val="0"/>
-                        </a:ext>
-                      </a:extLst>
-                    </a:blip>
-                    <a:stretch>
-                      <a:fillRect/>
-                    </a:stretch>
-                  </pic:blipFill>
-                  <pic:spPr>
-                    <a:xfrm>
-                      <a:off x="0" y="0"/>
-                      <a:ext cx="4878705" cy="2748280"/>
-                    </a:xfrm>
-                    <a:prstGeom prst="rect">
-                      <a:avLst/>
-                    </a:prstGeom>
-                  </pic:spPr>
-                </pic:pic>
-              </a:graphicData>
-            </a:graphic>
-          </wp:anchor>
-        </w:drawing>
-      </w:r>
-      <w:r>
-        <w:rPr>
-          <w:rFonts w:ascii="Arial" w:hAnsi="Arial" w:cs="Arial"/>
-          <w:sz w:val="24"/>
-          <w:szCs w:val="24"/>
-          <w:lang w:val="en-GB"/>
-        </w:rPr>
-        <w:t xml:space="preserve">For the robotics part of this project, I did not get as far as I would have liked. I got a simulation of the robot that we used for testing </w:t>
-      </w:r>
-      <w:proofErr w:type="gramStart"/>
-      <w:r>
-        <w:rPr>
-          <w:rFonts w:ascii="Arial" w:hAnsi="Arial" w:cs="Arial"/>
-          <w:sz w:val="24"/>
-          <w:szCs w:val="24"/>
-          <w:lang w:val="en-GB"/>
-        </w:rPr>
-        <w:t>moving</w:t>
-      </w:r>
-      <w:r>
-        <w:rPr>
-          <w:rFonts w:ascii="Arial" w:hAnsi="Arial" w:cs="Arial"/>
-          <w:sz w:val="24"/>
-          <w:szCs w:val="24"/>
-          <w:lang w:val="en-GB"/>
-        </w:rPr>
-        <w:t>(</w:t>
-      </w:r>
-      <w:proofErr w:type="gramEnd"/>
-      <w:r>
-        <w:rPr>
-          <w:rFonts w:ascii="Arial" w:hAnsi="Arial" w:cs="Arial"/>
-          <w:sz w:val="24"/>
-          <w:szCs w:val="24"/>
-          <w:lang w:val="en-GB"/>
-        </w:rPr>
-        <w:t>8.)</w:t>
-      </w:r>
-      <w:r>
-        <w:rPr>
-          <w:rFonts w:ascii="Arial" w:hAnsi="Arial" w:cs="Arial"/>
-          <w:sz w:val="24"/>
-          <w:szCs w:val="24"/>
-          <w:lang w:val="en-GB"/>
-        </w:rPr>
-        <w:t xml:space="preserve"> but I did not have time to </w:t>
-      </w:r>
-      <w:r>
-        <w:rPr>
-          <w:rFonts w:ascii="Arial" w:hAnsi="Arial" w:cs="Arial"/>
-          <w:sz w:val="24"/>
-          <w:szCs w:val="24"/>
-          <w:lang w:val="en-GB"/>
-        </w:rPr>
-        <w:t>make things automated.</w:t>
-      </w:r>
-      <w:r>
-        <w:rPr>
-          <w:rFonts w:ascii="Arial" w:hAnsi="Arial" w:cs="Arial"/>
-          <w:sz w:val="24"/>
-          <w:szCs w:val="24"/>
-        </w:rPr>
-        <w:t xml:space="preserve"> </w:t>
+          <w:rFonts w:ascii="Times New Roman" w:eastAsia="Times New Roman" w:hAnsi="Times New Roman" w:cs="Times New Roman"/>
+          <w:kern w:val="0"/>
+          <w:sz w:val="24"/>
+          <w:szCs w:val="24"/>
+          <w:lang w:eastAsia="en-GB"/>
+          <w14:ligatures w14:val="none"/>
+        </w:rPr>
+        <w:t>Documented findings and limitations to guide adoption as the toolkit's standard deployment process going forward</w:t>
       </w:r>
     </w:p>
     <w:p>
       <w:pPr>
-        <w:tabs>
-          <w:tab w:val="center" w:pos="4513"/>
-        </w:tabs>
-        <w:rPr>
-          <w:rFonts w:ascii="Arial" w:hAnsi="Arial" w:cs="Arial"/>
-          <w:sz w:val="24"/>
-          <w:szCs w:val="24"/>
-        </w:rPr>
-      </w:pPr>
+        <w:spacing w:before="100" w:beforeAutospacing="1" w:after="100" w:afterAutospacing="1" w:line="240" w:lineRule="auto"/>
+        <w:rPr>
+          <w:rFonts w:ascii="Times New Roman" w:eastAsia="Times New Roman" w:hAnsi="Times New Roman" w:cs="Times New Roman"/>
+          <w:kern w:val="0"/>
+          <w:sz w:val="24"/>
+          <w:szCs w:val="24"/>
+          <w:lang w:eastAsia="en-GB"/>
+          <w14:ligatures w14:val="none"/>
+        </w:rPr>
+      </w:pPr>
+      <w:r>
+        <w:rPr>
+          <w:rFonts w:ascii="Times New Roman" w:eastAsia="Times New Roman" w:hAnsi="Times New Roman" w:cs="Times New Roman"/>
+          <w:b/>
+          <w:bCs/>
+          <w:kern w:val="0"/>
+          <w:sz w:val="24"/>
+          <w:szCs w:val="24"/>
+          <w:lang w:eastAsia="en-GB"/>
+          <w14:ligatures w14:val="none"/>
+        </w:rPr>
+        <w:t>Data &amp; Analytics Intern — Stedin (Oct 2024 - Jan 2025)</w:t>
+      </w:r>
     </w:p>
     <w:p>
       <w:pPr>
-        <w:tabs>
-          <w:tab w:val="center" w:pos="4513"/>
-        </w:tabs>
-        <w:rPr>
-          <w:rFonts w:ascii="Arial" w:hAnsi="Arial" w:cs="Arial"/>
-          <w:sz w:val="24"/>
-          <w:szCs w:val="24"/>
-        </w:rPr>
-      </w:pPr>
+        <w:numPr>
+          <w:ilvl w:val="0"/>
+          <w:numId w:val="3"/>
+        </w:numPr>
+        <w:spacing w:before="100" w:beforeAutospacing="1" w:after="100" w:afterAutospacing="1" w:line="240" w:lineRule="auto"/>
+        <w:rPr>
+          <w:rFonts w:ascii="Times New Roman" w:eastAsia="Times New Roman" w:hAnsi="Times New Roman" w:cs="Times New Roman"/>
+          <w:kern w:val="0"/>
+          <w:sz w:val="24"/>
+          <w:szCs w:val="24"/>
+          <w:lang w:eastAsia="en-GB"/>
+          <w14:ligatures w14:val="none"/>
+        </w:rPr>
+      </w:pPr>
+      <w:r>
+        <w:rPr>
+          <w:rFonts w:ascii="Times New Roman" w:eastAsia="Times New Roman" w:hAnsi="Times New Roman" w:cs="Times New Roman"/>
+          <w:kern w:val="0"/>
+          <w:sz w:val="24"/>
+          <w:szCs w:val="24"/>
+          <w:lang w:eastAsia="en-GB"/>
+          <w14:ligatures w14:val="none"/>
+        </w:rPr>
+        <w:t>Built a Power BI dashboard to monitor green gas quality across 12 feeder locations for Stedin's green gas department, tracking O2, CO2, water dew point, pressure, H2S, and Wobbe index against regulatory thresholds</w:t>
+      </w:r>
+    </w:p>
+    <w:p>
+      <w:pPr>
+        <w:numPr>
+          <w:ilvl w:val="0"/>
+          <w:numId w:val="3"/>
+        </w:numPr>
+        <w:spacing w:before="100" w:beforeAutospacing="1" w:after="100" w:afterAutospacing="1" w:line="240" w:lineRule="auto"/>
+        <w:rPr>
+          <w:rFonts w:ascii="Times New Roman" w:eastAsia="Times New Roman" w:hAnsi="Times New Roman" w:cs="Times New Roman"/>
+          <w:kern w:val="0"/>
+          <w:sz w:val="24"/>
+          <w:szCs w:val="24"/>
+          <w:lang w:eastAsia="en-GB"/>
+          <w14:ligatures w14:val="none"/>
+        </w:rPr>
+      </w:pPr>
+      <w:r>
+        <w:rPr>
+          <w:rFonts w:ascii="Times New Roman" w:eastAsia="Times New Roman" w:hAnsi="Times New Roman" w:cs="Times New Roman"/>
+          <w:kern w:val="0"/>
+          <w:sz w:val="24"/>
+          <w:szCs w:val="24"/>
+          <w:lang w:eastAsia="en-GB"/>
+          <w14:ligatures w14:val="none"/>
+        </w:rPr>
+        <w:t>Automated the end-to-end data pipeline using Python-based RPA (since the vendor's API didn't support the required data format), replacing a manual process that took 15-30 minutes per location with reports Stedin previously received only every 6 months from a third party</w:t>
+      </w:r>
+    </w:p>
+    <w:p>
+      <w:pPr>
+        <w:numPr>
+          <w:ilvl w:val="0"/>
+          <w:numId w:val="3"/>
+        </w:numPr>
+        <w:spacing w:before="100" w:beforeAutospacing="1" w:after="100" w:afterAutospacing="1" w:line="240" w:lineRule="auto"/>
+        <w:rPr>
+          <w:rFonts w:ascii="Times New Roman" w:eastAsia="Times New Roman" w:hAnsi="Times New Roman" w:cs="Times New Roman"/>
+          <w:kern w:val="0"/>
+          <w:sz w:val="24"/>
+          <w:szCs w:val="24"/>
+          <w:lang w:eastAsia="en-GB"/>
+          <w14:ligatures w14:val="none"/>
+        </w:rPr>
+      </w:pPr>
+      <w:r>
+        <w:rPr>
+          <w:rFonts w:ascii="Times New Roman" w:eastAsia="Times New Roman" w:hAnsi="Times New Roman" w:cs="Times New Roman"/>
+          <w:kern w:val="0"/>
+          <w:sz w:val="24"/>
+          <w:szCs w:val="24"/>
+          <w:lang w:eastAsia="en-GB"/>
+          <w14:ligatures w14:val="none"/>
+        </w:rPr>
+        <w:t>Performed EDA and data cleaning across multi-location time-series data, identifying and resolving data quality issues (e.g., inconsistent pressure units at one site, systemic missing H2S data at others caused by a vendor's non-standard recording interval)</w:t>
+      </w:r>
+    </w:p>
+    <w:p>
+      <w:pPr>
+        <w:numPr>
+          <w:ilvl w:val="0"/>
+          <w:numId w:val="3"/>
+        </w:numPr>
+        <w:spacing w:before="100" w:beforeAutospacing="1" w:after="100" w:afterAutospacing="1" w:line="240" w:lineRule="auto"/>
+        <w:rPr>
+          <w:rFonts w:ascii="Times New Roman" w:eastAsia="Times New Roman" w:hAnsi="Times New Roman" w:cs="Times New Roman"/>
+          <w:kern w:val="0"/>
+          <w:sz w:val="24"/>
+          <w:szCs w:val="24"/>
+          <w:lang w:eastAsia="en-GB"/>
+          <w14:ligatures w14:val="none"/>
+        </w:rPr>
+      </w:pPr>
+      <w:r>
+        <w:rPr>
+          <w:rFonts w:ascii="Times New Roman" w:eastAsia="Times New Roman" w:hAnsi="Times New Roman" w:cs="Times New Roman"/>
+          <w:kern w:val="0"/>
+          <w:sz w:val="24"/>
+          <w:szCs w:val="24"/>
+          <w:lang w:eastAsia="en-GB"/>
+          <w14:ligatures w14:val="none"/>
+        </w:rPr>
+        <w:t>Reverse-engineered a complex Excel-based "Wobbe index" visualization and rebuilt it as a custom Python visual embedded in Power BI, translating spreadsheet formula logic into equivalent Python calculations</w:t>
+      </w:r>
+    </w:p>
+    <w:p>
+      <w:pPr>
+        <w:numPr>
+          <w:ilvl w:val="0"/>
+          <w:numId w:val="3"/>
+        </w:numPr>
+        <w:spacing w:before="100" w:beforeAutospacing="1" w:after="100" w:afterAutospacing="1" w:line="240" w:lineRule="auto"/>
+        <w:rPr>
+          <w:rFonts w:ascii="Times New Roman" w:eastAsia="Times New Roman" w:hAnsi="Times New Roman" w:cs="Times New Roman"/>
+          <w:kern w:val="0"/>
+          <w:sz w:val="24"/>
+          <w:szCs w:val="24"/>
+          <w:lang w:eastAsia="en-GB"/>
+          <w14:ligatures w14:val="none"/>
+        </w:rPr>
+      </w:pPr>
+      <w:r>
+        <w:rPr>
+          <w:rFonts w:ascii="Times New Roman" w:eastAsia="Times New Roman" w:hAnsi="Times New Roman" w:cs="Times New Roman"/>
+          <w:kern w:val="0"/>
+          <w:sz w:val="24"/>
+          <w:szCs w:val="24"/>
+          <w:lang w:eastAsia="en-GB"/>
+          <w14:ligatures w14:val="none"/>
+        </w:rPr>
+        <w:t>Deployed the solution as a standalone executable integrated with SharePoint, enabling non-technical supervisors to refresh data without manual intervention</w:t>
+      </w:r>
+    </w:p>
+    <w:p>
+      <w:pPr>
+        <w:numPr>
+          <w:ilvl w:val="0"/>
+          <w:numId w:val="3"/>
+        </w:numPr>
+        <w:spacing w:before="100" w:beforeAutospacing="1" w:after="100" w:afterAutospacing="1" w:line="240" w:lineRule="auto"/>
+        <w:rPr>
+          <w:rFonts w:ascii="Times New Roman" w:eastAsia="Times New Roman" w:hAnsi="Times New Roman" w:cs="Times New Roman"/>
+          <w:kern w:val="0"/>
+          <w:sz w:val="24"/>
+          <w:szCs w:val="24"/>
+          <w:lang w:eastAsia="en-GB"/>
+          <w14:ligatures w14:val="none"/>
+        </w:rPr>
+      </w:pPr>
+      <w:r>
+        <w:rPr>
+          <w:rFonts w:ascii="Times New Roman" w:eastAsia="Times New Roman" w:hAnsi="Times New Roman" w:cs="Times New Roman"/>
+          <w:kern w:val="0"/>
+          <w:sz w:val="24"/>
+          <w:szCs w:val="24"/>
+          <w:lang w:eastAsia="en-GB"/>
+          <w14:ligatures w14:val="none"/>
+        </w:rPr>
+        <w:t>Validated the dashboard through user testing with a Stedin colleague and presented it to a group of external gas providers, gathering feedback that shaped further iterations</w:t>
+      </w:r>
+    </w:p>
+    <w:p>
+      <w:pPr>
+        <w:spacing w:before="100" w:beforeAutospacing="1" w:after="100" w:afterAutospacing="1" w:line="240" w:lineRule="auto"/>
+        <w:rPr>
+          <w:rFonts w:ascii="Times New Roman" w:eastAsia="Times New Roman" w:hAnsi="Times New Roman" w:cs="Times New Roman"/>
+          <w:kern w:val="0"/>
+          <w:sz w:val="24"/>
+          <w:szCs w:val="24"/>
+          <w:lang w:eastAsia="en-GB"/>
+          <w14:ligatures w14:val="none"/>
+        </w:rPr>
+      </w:pPr>
+      <w:r>
+        <w:rPr>
+          <w:rFonts w:ascii="Times New Roman" w:eastAsia="Times New Roman" w:hAnsi="Times New Roman" w:cs="Times New Roman"/>
+          <w:b/>
+          <w:bCs/>
+          <w:kern w:val="0"/>
+          <w:sz w:val="24"/>
+          <w:szCs w:val="24"/>
+          <w:lang w:eastAsia="en-GB"/>
+          <w14:ligatures w14:val="none"/>
+        </w:rPr>
+        <w:lastRenderedPageBreak/>
+        <w:t>Data Engineer &amp; Analytics Translator — The Hive, Breda Guardians (BUas) (2024)</w:t>
+      </w:r>
+    </w:p>
+    <w:p>
+      <w:pPr>
+        <w:numPr>
+          <w:ilvl w:val="0"/>
+          <w:numId w:val="4"/>
+        </w:numPr>
+        <w:spacing w:before="100" w:beforeAutospacing="1" w:after="100" w:afterAutospacing="1" w:line="240" w:lineRule="auto"/>
+        <w:rPr>
+          <w:rFonts w:ascii="Times New Roman" w:eastAsia="Times New Roman" w:hAnsi="Times New Roman" w:cs="Times New Roman"/>
+          <w:kern w:val="0"/>
+          <w:sz w:val="24"/>
+          <w:szCs w:val="24"/>
+          <w:lang w:eastAsia="en-GB"/>
+          <w14:ligatures w14:val="none"/>
+        </w:rPr>
+      </w:pPr>
+      <w:r>
+        <w:rPr>
+          <w:rFonts w:ascii="Times New Roman" w:eastAsia="Times New Roman" w:hAnsi="Times New Roman" w:cs="Times New Roman"/>
+          <w:kern w:val="0"/>
+          <w:sz w:val="24"/>
+          <w:szCs w:val="24"/>
+          <w:lang w:eastAsia="en-GB"/>
+          <w14:ligatures w14:val="none"/>
+        </w:rPr>
+        <w:t>Built the first end-to-end data pipeline for a multi-year esports analytics project as part of the founding student cohort, with no existing infrastructure to build on</w:t>
+      </w:r>
+    </w:p>
+    <w:p>
+      <w:pPr>
+        <w:numPr>
+          <w:ilvl w:val="0"/>
+          <w:numId w:val="4"/>
+        </w:numPr>
+        <w:spacing w:before="100" w:beforeAutospacing="1" w:after="100" w:afterAutospacing="1" w:line="240" w:lineRule="auto"/>
+        <w:rPr>
+          <w:rFonts w:ascii="Times New Roman" w:eastAsia="Times New Roman" w:hAnsi="Times New Roman" w:cs="Times New Roman"/>
+          <w:kern w:val="0"/>
+          <w:sz w:val="24"/>
+          <w:szCs w:val="24"/>
+          <w:lang w:eastAsia="en-GB"/>
+          <w14:ligatures w14:val="none"/>
+        </w:rPr>
+      </w:pPr>
+      <w:r>
+        <w:rPr>
+          <w:rFonts w:ascii="Times New Roman" w:eastAsia="Times New Roman" w:hAnsi="Times New Roman" w:cs="Times New Roman"/>
+          <w:kern w:val="0"/>
+          <w:sz w:val="24"/>
+          <w:szCs w:val="24"/>
+          <w:lang w:eastAsia="en-GB"/>
+          <w14:ligatures w14:val="none"/>
+        </w:rPr>
+        <w:t>Engineered a multi-modal data collection pipeline capturing keyboard/mouse input, Tobii eye-tracker gaze data, webcam-based facial emotion recognition (via OpenFace), and OBS video capture</w:t>
+      </w:r>
+    </w:p>
+    <w:p>
+      <w:pPr>
+        <w:numPr>
+          <w:ilvl w:val="0"/>
+          <w:numId w:val="4"/>
+        </w:numPr>
+        <w:spacing w:before="100" w:beforeAutospacing="1" w:after="100" w:afterAutospacing="1" w:line="240" w:lineRule="auto"/>
+        <w:rPr>
+          <w:rFonts w:ascii="Times New Roman" w:eastAsia="Times New Roman" w:hAnsi="Times New Roman" w:cs="Times New Roman"/>
+          <w:kern w:val="0"/>
+          <w:sz w:val="24"/>
+          <w:szCs w:val="24"/>
+          <w:lang w:eastAsia="en-GB"/>
+          <w14:ligatures w14:val="none"/>
+        </w:rPr>
+      </w:pPr>
+      <w:r>
+        <w:rPr>
+          <w:rFonts w:ascii="Times New Roman" w:eastAsia="Times New Roman" w:hAnsi="Times New Roman" w:cs="Times New Roman"/>
+          <w:kern w:val="0"/>
+          <w:sz w:val="24"/>
+          <w:szCs w:val="24"/>
+          <w:lang w:eastAsia="en-GB"/>
+          <w14:ligatures w14:val="none"/>
+        </w:rPr>
+        <w:t>Designed a dual-storage architecture (SFTP for bulk files, PostgreSQL for structured/queryable data), containerized in Docker for reliable, repeatable deployment on shared infrastructure</w:t>
+      </w:r>
+    </w:p>
+    <w:p>
+      <w:pPr>
+        <w:numPr>
+          <w:ilvl w:val="0"/>
+          <w:numId w:val="4"/>
+        </w:numPr>
+        <w:spacing w:before="100" w:beforeAutospacing="1" w:after="100" w:afterAutospacing="1" w:line="240" w:lineRule="auto"/>
+        <w:rPr>
+          <w:rFonts w:ascii="Times New Roman" w:eastAsia="Times New Roman" w:hAnsi="Times New Roman" w:cs="Times New Roman"/>
+          <w:kern w:val="0"/>
+          <w:sz w:val="24"/>
+          <w:szCs w:val="24"/>
+          <w:lang w:eastAsia="en-GB"/>
+          <w14:ligatures w14:val="none"/>
+        </w:rPr>
+      </w:pPr>
+      <w:r>
+        <w:rPr>
+          <w:rFonts w:ascii="Times New Roman" w:eastAsia="Times New Roman" w:hAnsi="Times New Roman" w:cs="Times New Roman"/>
+          <w:kern w:val="0"/>
+          <w:sz w:val="24"/>
+          <w:szCs w:val="24"/>
+          <w:lang w:eastAsia="en-GB"/>
+          <w14:ligatures w14:val="none"/>
+        </w:rPr>
+        <w:t>Automated the pipeline so that ending a data collection session triggers automatic upload to SFTP and PostgreSQL, feeding a live progress dashboard with zero manual handling</w:t>
+      </w:r>
+    </w:p>
+    <w:p>
+      <w:pPr>
+        <w:numPr>
+          <w:ilvl w:val="0"/>
+          <w:numId w:val="4"/>
+        </w:numPr>
+        <w:spacing w:before="100" w:beforeAutospacing="1" w:after="100" w:afterAutospacing="1" w:line="240" w:lineRule="auto"/>
+        <w:rPr>
+          <w:rFonts w:ascii="Times New Roman" w:eastAsia="Times New Roman" w:hAnsi="Times New Roman" w:cs="Times New Roman"/>
+          <w:kern w:val="0"/>
+          <w:sz w:val="24"/>
+          <w:szCs w:val="24"/>
+          <w:lang w:eastAsia="en-GB"/>
+          <w14:ligatures w14:val="none"/>
+        </w:rPr>
+      </w:pPr>
+      <w:r>
+        <w:rPr>
+          <w:rFonts w:ascii="Times New Roman" w:eastAsia="Times New Roman" w:hAnsi="Times New Roman" w:cs="Times New Roman"/>
+          <w:kern w:val="0"/>
+          <w:sz w:val="24"/>
+          <w:szCs w:val="24"/>
+          <w:lang w:eastAsia="en-GB"/>
+          <w14:ligatures w14:val="none"/>
+        </w:rPr>
+        <w:t>Scoped the project's original "AI coach" ambition down to a realistic, reusable foundation, enabling subsequent cohorts to build analytics directly on top of the pipeline</w:t>
+      </w:r>
+    </w:p>
+    <w:p>
+      <w:pPr>
+        <w:spacing w:before="100" w:beforeAutospacing="1" w:after="100" w:afterAutospacing="1" w:line="240" w:lineRule="auto"/>
+        <w:rPr>
+          <w:rFonts w:ascii="Times New Roman" w:eastAsia="Times New Roman" w:hAnsi="Times New Roman" w:cs="Times New Roman"/>
+          <w:kern w:val="0"/>
+          <w:sz w:val="24"/>
+          <w:szCs w:val="24"/>
+          <w:lang w:eastAsia="en-GB"/>
+          <w14:ligatures w14:val="none"/>
+        </w:rPr>
+      </w:pPr>
+      <w:r>
+        <w:rPr>
+          <w:rFonts w:ascii="Times New Roman" w:eastAsia="Times New Roman" w:hAnsi="Times New Roman" w:cs="Times New Roman"/>
+          <w:b/>
+          <w:bCs/>
+          <w:kern w:val="0"/>
+          <w:sz w:val="24"/>
+          <w:szCs w:val="24"/>
+          <w:lang w:eastAsia="en-GB"/>
+          <w14:ligatures w14:val="none"/>
+        </w:rPr>
+        <w:t>Data Scientist — NPEC Utrecht / BUas (2023-2024)</w:t>
+      </w:r>
+    </w:p>
+    <w:p>
+      <w:pPr>
+        <w:numPr>
+          <w:ilvl w:val="0"/>
+          <w:numId w:val="5"/>
+        </w:numPr>
+        <w:spacing w:before="100" w:beforeAutospacing="1" w:after="100" w:afterAutospacing="1" w:line="240" w:lineRule="auto"/>
+        <w:rPr>
+          <w:rFonts w:ascii="Times New Roman" w:eastAsia="Times New Roman" w:hAnsi="Times New Roman" w:cs="Times New Roman"/>
+          <w:kern w:val="0"/>
+          <w:sz w:val="24"/>
+          <w:szCs w:val="24"/>
+          <w:lang w:eastAsia="en-GB"/>
+          <w14:ligatures w14:val="none"/>
+        </w:rPr>
+      </w:pPr>
+      <w:r>
+        <w:rPr>
+          <w:rFonts w:ascii="Times New Roman" w:eastAsia="Times New Roman" w:hAnsi="Times New Roman" w:cs="Times New Roman"/>
+          <w:kern w:val="0"/>
+          <w:sz w:val="24"/>
+          <w:szCs w:val="24"/>
+          <w:lang w:eastAsia="en-GB"/>
+          <w14:ligatures w14:val="none"/>
+        </w:rPr>
+        <w:t>Built a computer vision pipeline using U-Net image segmentation to isolate plant roots from raw camera images for an autonomous plant-watering system</w:t>
+      </w:r>
+    </w:p>
+    <w:p>
+      <w:pPr>
+        <w:numPr>
+          <w:ilvl w:val="0"/>
+          <w:numId w:val="5"/>
+        </w:numPr>
+        <w:spacing w:before="100" w:beforeAutospacing="1" w:after="100" w:afterAutospacing="1" w:line="240" w:lineRule="auto"/>
+        <w:rPr>
+          <w:rFonts w:ascii="Times New Roman" w:eastAsia="Times New Roman" w:hAnsi="Times New Roman" w:cs="Times New Roman"/>
+          <w:kern w:val="0"/>
+          <w:sz w:val="24"/>
+          <w:szCs w:val="24"/>
+          <w:lang w:eastAsia="en-GB"/>
+          <w14:ligatures w14:val="none"/>
+        </w:rPr>
+      </w:pPr>
+      <w:r>
+        <w:rPr>
+          <w:rFonts w:ascii="Times New Roman" w:eastAsia="Times New Roman" w:hAnsi="Times New Roman" w:cs="Times New Roman"/>
+          <w:kern w:val="0"/>
+          <w:sz w:val="24"/>
+          <w:szCs w:val="24"/>
+          <w:lang w:eastAsia="en-GB"/>
+          <w14:ligatures w14:val="none"/>
+        </w:rPr>
+        <w:t>Applied image skeletonization to reduce segmented roots to single-pixel-wide lines, enabling precise extraction of root-tip coordinates and main root length</w:t>
+      </w:r>
+    </w:p>
+    <w:p>
+      <w:pPr>
+        <w:numPr>
+          <w:ilvl w:val="0"/>
+          <w:numId w:val="5"/>
+        </w:numPr>
+        <w:spacing w:before="100" w:beforeAutospacing="1" w:after="100" w:afterAutospacing="1" w:line="240" w:lineRule="auto"/>
+        <w:rPr>
+          <w:rFonts w:ascii="Times New Roman" w:eastAsia="Times New Roman" w:hAnsi="Times New Roman" w:cs="Times New Roman"/>
+          <w:kern w:val="0"/>
+          <w:sz w:val="24"/>
+          <w:szCs w:val="24"/>
+          <w:lang w:eastAsia="en-GB"/>
+          <w14:ligatures w14:val="none"/>
+        </w:rPr>
+      </w:pPr>
+      <w:r>
+        <w:rPr>
+          <w:rFonts w:ascii="Times New Roman" w:eastAsia="Times New Roman" w:hAnsi="Times New Roman" w:cs="Times New Roman"/>
+          <w:kern w:val="0"/>
+          <w:sz w:val="24"/>
+          <w:szCs w:val="24"/>
+          <w:lang w:eastAsia="en-GB"/>
+          <w14:ligatures w14:val="none"/>
+        </w:rPr>
+        <w:t>Delivered an end-to-end pipeline from raw image to root-length measurement, meeting NPEC researchers' requirement for tracking plant growth over time</w:t>
+      </w:r>
+    </w:p>
+    <w:p>
+      <w:pPr>
+        <w:numPr>
+          <w:ilvl w:val="0"/>
+          <w:numId w:val="5"/>
+        </w:numPr>
+        <w:spacing w:before="100" w:beforeAutospacing="1" w:after="100" w:afterAutospacing="1" w:line="240" w:lineRule="auto"/>
+        <w:rPr>
+          <w:rFonts w:ascii="Times New Roman" w:eastAsia="Times New Roman" w:hAnsi="Times New Roman" w:cs="Times New Roman"/>
+          <w:kern w:val="0"/>
+          <w:sz w:val="24"/>
+          <w:szCs w:val="24"/>
+          <w:lang w:eastAsia="en-GB"/>
+          <w14:ligatures w14:val="none"/>
+        </w:rPr>
+      </w:pPr>
+      <w:r>
+        <w:rPr>
+          <w:rFonts w:ascii="Times New Roman" w:eastAsia="Times New Roman" w:hAnsi="Times New Roman" w:cs="Times New Roman"/>
+          <w:kern w:val="0"/>
+          <w:sz w:val="24"/>
+          <w:szCs w:val="24"/>
+          <w:lang w:eastAsia="en-GB"/>
+          <w14:ligatures w14:val="none"/>
+        </w:rPr>
+        <w:t>Validated the approach with a working robot-arm simulation targeting the extracted coordinates, scoping full watering automation as next-stage work</w:t>
+      </w:r>
     </w:p>
     <w:p>
       <w:pPr>
@@ -7919,6 +5786,304 @@
 <file path=word/numbering.xml><?xml version="1.0" encoding="utf-8"?>
 <w:numbering xmlns:wpc="http://schemas.microsoft.com/office/word/2010/wordprocessingCanvas" xmlns:cx="http://schemas.microsoft.com/office/drawing/2014/chartex" xmlns:cx1="http://schemas.microsoft.com/office/drawing/2015/9/8/chartex" xmlns:cx2="http://schemas.microsoft.com/office/drawing/2015/10/21/chartex" xmlns:cx3="http://schemas.microsoft.com/office/drawing/2016/5/9/chartex" xmlns:cx4="http://schemas.microsoft.com/office/drawing/2016/5/10/chartex" xmlns:cx5="http://schemas.microsoft.com/office/drawing/2016/5/11/chartex" xmlns:cx6="http://schemas.microsoft.com/office/drawing/2016/5/12/chartex" xmlns:cx7="http://schemas.microsoft.com/office/drawing/2016/5/13/chartex" xmlns:cx8="http://schemas.microsoft.com/office/drawing/2016/5/14/chartex" xmlns:mc="http://schemas.openxmlformats.org/markup-compatibility/2006" xmlns:m="http://schemas.openxmlformats.org/officeDocument/2006/math" xmlns:aink="http://schemas.microsoft.com/office/drawing/2016/ink" xmlns:am3d="http://schemas.microsoft.com/office/drawing/2017/model3d" xmlns:oel="http://schemas.microsoft.com/office/2019/extlst" xmlns:r="http://schemas.openxmlformats.org/officeDocument/2006/relationships" xmlns:wp14="http://schemas.microsoft.com/office/word/2010/wordprocessingDrawing" xmlns:wp="http://schemas.openxmlformats.org/drawingml/2006/wordprocessingDrawing" xmlns:wpg="http://schemas.microsoft.com/office/word/2010/wordprocessingGroup" xmlns:wpi="http://schemas.microsoft.com/office/word/2010/wordprocessingInk" xmlns:wps="http://schemas.microsoft.com/office/word/2010/wordprocessingShape" xmlns:o="urn:schemas-microsoft-com:office:office" xmlns:v="urn:schemas-microsoft-com:vml" xmlns:w10="urn:schemas-microsoft-com:office:word" xmlns:w="http://schemas.openxmlformats.org/wordprocessingml/2006/main" xmlns:w14="http://schemas.microsoft.com/office/word/2010/wordml" xmlns:w15="http://schemas.microsoft.com/office/word/2012/wordml" xmlns:w16cex="http://schemas.microsoft.com/office/word/2018/wordml/cex" xmlns:w16cid="http://schemas.microsoft.com/office/word/2016/wordml/cid" xmlns:w16="http://schemas.microsoft.com/office/word/2018/wordml" xmlns:w16sdtdh="http://schemas.microsoft.com/office/word/2020/wordml/sdtdatahash" xmlns:w16sdtfl="http://schemas.microsoft.com/office/word/2024/wordml/sdtformatlock" xmlns:w16se="http://schemas.microsoft.com/office/word/2015/wordml/symex" xmlns:w16du="http://schemas.microsoft.com/office/word/2023/wordml/word16du" xmlns:wne="http://schemas.microsoft.com/office/word/2006/wordml" mc:Ignorable="w14 w15 w16se w16cid w16 w16cex w16sdtdh w16sdtfl w16du wp14">
   <w:abstractNum w:abstractNumId="0" w15:restartNumberingAfterBreak="0">
+    <w:nsid w:val="0A256004"/>
+    <w:multiLevelType w:val="multilevel"/>
+    <w:tmpl w:val="9E081E86"/>
+    <w:lvl w:ilvl="0">
+      <w:start w:val="1"/>
+      <w:numFmt w:val="bullet"/>
+      <w:lvlText w:val=""/>
+      <w:lvlJc w:val="left"/>
+      <w:pPr>
+        <w:tabs>
+          <w:tab w:val="num" w:pos="720"/>
+        </w:tabs>
+        <w:ind w:left="720" w:hanging="360"/>
+      </w:pPr>
+      <w:rPr>
+        <w:rFonts w:ascii="Symbol" w:hAnsi="Symbol" w:hint="default"/>
+        <w:sz w:val="20"/>
+      </w:rPr>
+    </w:lvl>
+    <w:lvl w:ilvl="1" w:tentative="1">
+      <w:start w:val="1"/>
+      <w:numFmt w:val="bullet"/>
+      <w:lvlText w:val="o"/>
+      <w:lvlJc w:val="left"/>
+      <w:pPr>
+        <w:tabs>
+          <w:tab w:val="num" w:pos="1440"/>
+        </w:tabs>
+        <w:ind w:left="1440" w:hanging="360"/>
+      </w:pPr>
+      <w:rPr>
+        <w:rFonts w:ascii="Courier New" w:hAnsi="Courier New" w:hint="default"/>
+        <w:sz w:val="20"/>
+      </w:rPr>
+    </w:lvl>
+    <w:lvl w:ilvl="2" w:tentative="1">
+      <w:start w:val="1"/>
+      <w:numFmt w:val="bullet"/>
+      <w:lvlText w:val=""/>
+      <w:lvlJc w:val="left"/>
+      <w:pPr>
+        <w:tabs>
+          <w:tab w:val="num" w:pos="2160"/>
+        </w:tabs>
+        <w:ind w:left="2160" w:hanging="360"/>
+      </w:pPr>
+      <w:rPr>
+        <w:rFonts w:ascii="Wingdings" w:hAnsi="Wingdings" w:hint="default"/>
+        <w:sz w:val="20"/>
+      </w:rPr>
+    </w:lvl>
+    <w:lvl w:ilvl="3" w:tentative="1">
+      <w:start w:val="1"/>
+      <w:numFmt w:val="bullet"/>
+      <w:lvlText w:val=""/>
+      <w:lvlJc w:val="left"/>
+      <w:pPr>
+        <w:tabs>
+          <w:tab w:val="num" w:pos="2880"/>
+        </w:tabs>
+        <w:ind w:left="2880" w:hanging="360"/>
+      </w:pPr>
+      <w:rPr>
+        <w:rFonts w:ascii="Wingdings" w:hAnsi="Wingdings" w:hint="default"/>
+        <w:sz w:val="20"/>
+      </w:rPr>
+    </w:lvl>
+    <w:lvl w:ilvl="4" w:tentative="1">
+      <w:start w:val="1"/>
+      <w:numFmt w:val="bullet"/>
+      <w:lvlText w:val=""/>
+      <w:lvlJc w:val="left"/>
+      <w:pPr>
+        <w:tabs>
+          <w:tab w:val="num" w:pos="3600"/>
+        </w:tabs>
+        <w:ind w:left="3600" w:hanging="360"/>
+      </w:pPr>
+      <w:rPr>
+        <w:rFonts w:ascii="Wingdings" w:hAnsi="Wingdings" w:hint="default"/>
+        <w:sz w:val="20"/>
+      </w:rPr>
+    </w:lvl>
+    <w:lvl w:ilvl="5" w:tentative="1">
+      <w:start w:val="1"/>
+      <w:numFmt w:val="bullet"/>
+      <w:lvlText w:val=""/>
+      <w:lvlJc w:val="left"/>
+      <w:pPr>
+        <w:tabs>
+          <w:tab w:val="num" w:pos="4320"/>
+        </w:tabs>
+        <w:ind w:left="4320" w:hanging="360"/>
+      </w:pPr>
+      <w:rPr>
+        <w:rFonts w:ascii="Wingdings" w:hAnsi="Wingdings" w:hint="default"/>
+        <w:sz w:val="20"/>
+      </w:rPr>
+    </w:lvl>
+    <w:lvl w:ilvl="6" w:tentative="1">
+      <w:start w:val="1"/>
+      <w:numFmt w:val="bullet"/>
+      <w:lvlText w:val=""/>
+      <w:lvlJc w:val="left"/>
+      <w:pPr>
+        <w:tabs>
+          <w:tab w:val="num" w:pos="5040"/>
+        </w:tabs>
+        <w:ind w:left="5040" w:hanging="360"/>
+      </w:pPr>
+      <w:rPr>
+        <w:rFonts w:ascii="Wingdings" w:hAnsi="Wingdings" w:hint="default"/>
+        <w:sz w:val="20"/>
+      </w:rPr>
+    </w:lvl>
+    <w:lvl w:ilvl="7" w:tentative="1">
+      <w:start w:val="1"/>
+      <w:numFmt w:val="bullet"/>
+      <w:lvlText w:val=""/>
+      <w:lvlJc w:val="left"/>
+      <w:pPr>
+        <w:tabs>
+          <w:tab w:val="num" w:pos="5760"/>
+        </w:tabs>
+        <w:ind w:left="5760" w:hanging="360"/>
+      </w:pPr>
+      <w:rPr>
+        <w:rFonts w:ascii="Wingdings" w:hAnsi="Wingdings" w:hint="default"/>
+        <w:sz w:val="20"/>
+      </w:rPr>
+    </w:lvl>
+    <w:lvl w:ilvl="8" w:tentative="1">
+      <w:start w:val="1"/>
+      <w:numFmt w:val="bullet"/>
+      <w:lvlText w:val=""/>
+      <w:lvlJc w:val="left"/>
+      <w:pPr>
+        <w:tabs>
+          <w:tab w:val="num" w:pos="6480"/>
+        </w:tabs>
+        <w:ind w:left="6480" w:hanging="360"/>
+      </w:pPr>
+      <w:rPr>
+        <w:rFonts w:ascii="Wingdings" w:hAnsi="Wingdings" w:hint="default"/>
+        <w:sz w:val="20"/>
+      </w:rPr>
+    </w:lvl>
+  </w:abstractNum>
+  <w:abstractNum w:abstractNumId="1" w15:restartNumberingAfterBreak="0">
+    <w:nsid w:val="344B6A7C"/>
+    <w:multiLevelType w:val="multilevel"/>
+    <w:tmpl w:val="E4669AE6"/>
+    <w:lvl w:ilvl="0">
+      <w:start w:val="1"/>
+      <w:numFmt w:val="bullet"/>
+      <w:lvlText w:val=""/>
+      <w:lvlJc w:val="left"/>
+      <w:pPr>
+        <w:tabs>
+          <w:tab w:val="num" w:pos="720"/>
+        </w:tabs>
+        <w:ind w:left="720" w:hanging="360"/>
+      </w:pPr>
+      <w:rPr>
+        <w:rFonts w:ascii="Symbol" w:hAnsi="Symbol" w:hint="default"/>
+        <w:sz w:val="20"/>
+      </w:rPr>
+    </w:lvl>
+    <w:lvl w:ilvl="1" w:tentative="1">
+      <w:start w:val="1"/>
+      <w:numFmt w:val="bullet"/>
+      <w:lvlText w:val="o"/>
+      <w:lvlJc w:val="left"/>
+      <w:pPr>
+        <w:tabs>
+          <w:tab w:val="num" w:pos="1440"/>
+        </w:tabs>
+        <w:ind w:left="1440" w:hanging="360"/>
+      </w:pPr>
+      <w:rPr>
+        <w:rFonts w:ascii="Courier New" w:hAnsi="Courier New" w:hint="default"/>
+        <w:sz w:val="20"/>
+      </w:rPr>
+    </w:lvl>
+    <w:lvl w:ilvl="2" w:tentative="1">
+      <w:start w:val="1"/>
+      <w:numFmt w:val="bullet"/>
+      <w:lvlText w:val=""/>
+      <w:lvlJc w:val="left"/>
+      <w:pPr>
+        <w:tabs>
+          <w:tab w:val="num" w:pos="2160"/>
+        </w:tabs>
+        <w:ind w:left="2160" w:hanging="360"/>
+      </w:pPr>
+      <w:rPr>
+        <w:rFonts w:ascii="Wingdings" w:hAnsi="Wingdings" w:hint="default"/>
+        <w:sz w:val="20"/>
+      </w:rPr>
+    </w:lvl>
+    <w:lvl w:ilvl="3" w:tentative="1">
+      <w:start w:val="1"/>
+      <w:numFmt w:val="bullet"/>
+      <w:lvlText w:val=""/>
+      <w:lvlJc w:val="left"/>
+      <w:pPr>
+        <w:tabs>
+          <w:tab w:val="num" w:pos="2880"/>
+        </w:tabs>
+        <w:ind w:left="2880" w:hanging="360"/>
+      </w:pPr>
+      <w:rPr>
+        <w:rFonts w:ascii="Wingdings" w:hAnsi="Wingdings" w:hint="default"/>
+        <w:sz w:val="20"/>
+      </w:rPr>
+    </w:lvl>
+    <w:lvl w:ilvl="4" w:tentative="1">
+      <w:start w:val="1"/>
+      <w:numFmt w:val="bullet"/>
+      <w:lvlText w:val=""/>
+      <w:lvlJc w:val="left"/>
+      <w:pPr>
+        <w:tabs>
+          <w:tab w:val="num" w:pos="3600"/>
+        </w:tabs>
+        <w:ind w:left="3600" w:hanging="360"/>
+      </w:pPr>
+      <w:rPr>
+        <w:rFonts w:ascii="Wingdings" w:hAnsi="Wingdings" w:hint="default"/>
+        <w:sz w:val="20"/>
+      </w:rPr>
+    </w:lvl>
+    <w:lvl w:ilvl="5" w:tentative="1">
+      <w:start w:val="1"/>
+      <w:numFmt w:val="bullet"/>
+      <w:lvlText w:val=""/>
+      <w:lvlJc w:val="left"/>
+      <w:pPr>
+        <w:tabs>
+          <w:tab w:val="num" w:pos="4320"/>
+        </w:tabs>
+        <w:ind w:left="4320" w:hanging="360"/>
+      </w:pPr>
+      <w:rPr>
+        <w:rFonts w:ascii="Wingdings" w:hAnsi="Wingdings" w:hint="default"/>
+        <w:sz w:val="20"/>
+      </w:rPr>
+    </w:lvl>
+    <w:lvl w:ilvl="6" w:tentative="1">
+      <w:start w:val="1"/>
+      <w:numFmt w:val="bullet"/>
+      <w:lvlText w:val=""/>
+      <w:lvlJc w:val="left"/>
+      <w:pPr>
+        <w:tabs>
+          <w:tab w:val="num" w:pos="5040"/>
+        </w:tabs>
+        <w:ind w:left="5040" w:hanging="360"/>
+      </w:pPr>
+      <w:rPr>
+        <w:rFonts w:ascii="Wingdings" w:hAnsi="Wingdings" w:hint="default"/>
+        <w:sz w:val="20"/>
+      </w:rPr>
+    </w:lvl>
+    <w:lvl w:ilvl="7" w:tentative="1">
+      <w:start w:val="1"/>
+      <w:numFmt w:val="bullet"/>
+      <w:lvlText w:val=""/>
+      <w:lvlJc w:val="left"/>
+      <w:pPr>
+        <w:tabs>
+          <w:tab w:val="num" w:pos="5760"/>
+        </w:tabs>
+        <w:ind w:left="5760" w:hanging="360"/>
+      </w:pPr>
+      <w:rPr>
+        <w:rFonts w:ascii="Wingdings" w:hAnsi="Wingdings" w:hint="default"/>
+        <w:sz w:val="20"/>
+      </w:rPr>
+    </w:lvl>
+    <w:lvl w:ilvl="8" w:tentative="1">
+      <w:start w:val="1"/>
+      <w:numFmt w:val="bullet"/>
+      <w:lvlText w:val=""/>
+      <w:lvlJc w:val="left"/>
+      <w:pPr>
+        <w:tabs>
+          <w:tab w:val="num" w:pos="6480"/>
+        </w:tabs>
+        <w:ind w:left="6480" w:hanging="360"/>
+      </w:pPr>
+      <w:rPr>
+        <w:rFonts w:ascii="Wingdings" w:hAnsi="Wingdings" w:hint="default"/>
+        <w:sz w:val="20"/>
+      </w:rPr>
+    </w:lvl>
+  </w:abstractNum>
+  <w:abstractNum w:abstractNumId="2" w15:restartNumberingAfterBreak="0">
     <w:nsid w:val="4F0D7E92"/>
     <w:multiLevelType w:val="hybridMultilevel"/>
     <w:tmpl w:val="2BA25436"/>
@@ -8031,7 +6196,317 @@
       </w:rPr>
     </w:lvl>
   </w:abstractNum>
+  <w:abstractNum w:abstractNumId="3" w15:restartNumberingAfterBreak="0">
+    <w:nsid w:val="60AE34EE"/>
+    <w:multiLevelType w:val="multilevel"/>
+    <w:tmpl w:val="77A44104"/>
+    <w:lvl w:ilvl="0">
+      <w:start w:val="1"/>
+      <w:numFmt w:val="bullet"/>
+      <w:lvlText w:val=""/>
+      <w:lvlJc w:val="left"/>
+      <w:pPr>
+        <w:tabs>
+          <w:tab w:val="num" w:pos="720"/>
+        </w:tabs>
+        <w:ind w:left="720" w:hanging="360"/>
+      </w:pPr>
+      <w:rPr>
+        <w:rFonts w:ascii="Symbol" w:hAnsi="Symbol" w:hint="default"/>
+        <w:sz w:val="20"/>
+      </w:rPr>
+    </w:lvl>
+    <w:lvl w:ilvl="1" w:tentative="1">
+      <w:start w:val="1"/>
+      <w:numFmt w:val="bullet"/>
+      <w:lvlText w:val="o"/>
+      <w:lvlJc w:val="left"/>
+      <w:pPr>
+        <w:tabs>
+          <w:tab w:val="num" w:pos="1440"/>
+        </w:tabs>
+        <w:ind w:left="1440" w:hanging="360"/>
+      </w:pPr>
+      <w:rPr>
+        <w:rFonts w:ascii="Courier New" w:hAnsi="Courier New" w:hint="default"/>
+        <w:sz w:val="20"/>
+      </w:rPr>
+    </w:lvl>
+    <w:lvl w:ilvl="2" w:tentative="1">
+      <w:start w:val="1"/>
+      <w:numFmt w:val="bullet"/>
+      <w:lvlText w:val=""/>
+      <w:lvlJc w:val="left"/>
+      <w:pPr>
+        <w:tabs>
+          <w:tab w:val="num" w:pos="2160"/>
+        </w:tabs>
+        <w:ind w:left="2160" w:hanging="360"/>
+      </w:pPr>
+      <w:rPr>
+        <w:rFonts w:ascii="Wingdings" w:hAnsi="Wingdings" w:hint="default"/>
+        <w:sz w:val="20"/>
+      </w:rPr>
+    </w:lvl>
+    <w:lvl w:ilvl="3" w:tentative="1">
+      <w:start w:val="1"/>
+      <w:numFmt w:val="bullet"/>
+      <w:lvlText w:val=""/>
+      <w:lvlJc w:val="left"/>
+      <w:pPr>
+        <w:tabs>
+          <w:tab w:val="num" w:pos="2880"/>
+        </w:tabs>
+        <w:ind w:left="2880" w:hanging="360"/>
+      </w:pPr>
+      <w:rPr>
+        <w:rFonts w:ascii="Wingdings" w:hAnsi="Wingdings" w:hint="default"/>
+        <w:sz w:val="20"/>
+      </w:rPr>
+    </w:lvl>
+    <w:lvl w:ilvl="4" w:tentative="1">
+      <w:start w:val="1"/>
+      <w:numFmt w:val="bullet"/>
+      <w:lvlText w:val=""/>
+      <w:lvlJc w:val="left"/>
+      <w:pPr>
+        <w:tabs>
+          <w:tab w:val="num" w:pos="3600"/>
+        </w:tabs>
+        <w:ind w:left="3600" w:hanging="360"/>
+      </w:pPr>
+      <w:rPr>
+        <w:rFonts w:ascii="Wingdings" w:hAnsi="Wingdings" w:hint="default"/>
+        <w:sz w:val="20"/>
+      </w:rPr>
+    </w:lvl>
+    <w:lvl w:ilvl="5" w:tentative="1">
+      <w:start w:val="1"/>
+      <w:numFmt w:val="bullet"/>
+      <w:lvlText w:val=""/>
+      <w:lvlJc w:val="left"/>
+      <w:pPr>
+        <w:tabs>
+          <w:tab w:val="num" w:pos="4320"/>
+        </w:tabs>
+        <w:ind w:left="4320" w:hanging="360"/>
+      </w:pPr>
+      <w:rPr>
+        <w:rFonts w:ascii="Wingdings" w:hAnsi="Wingdings" w:hint="default"/>
+        <w:sz w:val="20"/>
+      </w:rPr>
+    </w:lvl>
+    <w:lvl w:ilvl="6" w:tentative="1">
+      <w:start w:val="1"/>
+      <w:numFmt w:val="bullet"/>
+      <w:lvlText w:val=""/>
+      <w:lvlJc w:val="left"/>
+      <w:pPr>
+        <w:tabs>
+          <w:tab w:val="num" w:pos="5040"/>
+        </w:tabs>
+        <w:ind w:left="5040" w:hanging="360"/>
+      </w:pPr>
+      <w:rPr>
+        <w:rFonts w:ascii="Wingdings" w:hAnsi="Wingdings" w:hint="default"/>
+        <w:sz w:val="20"/>
+      </w:rPr>
+    </w:lvl>
+    <w:lvl w:ilvl="7" w:tentative="1">
+      <w:start w:val="1"/>
+      <w:numFmt w:val="bullet"/>
+      <w:lvlText w:val=""/>
+      <w:lvlJc w:val="left"/>
+      <w:pPr>
+        <w:tabs>
+          <w:tab w:val="num" w:pos="5760"/>
+        </w:tabs>
+        <w:ind w:left="5760" w:hanging="360"/>
+      </w:pPr>
+      <w:rPr>
+        <w:rFonts w:ascii="Wingdings" w:hAnsi="Wingdings" w:hint="default"/>
+        <w:sz w:val="20"/>
+      </w:rPr>
+    </w:lvl>
+    <w:lvl w:ilvl="8" w:tentative="1">
+      <w:start w:val="1"/>
+      <w:numFmt w:val="bullet"/>
+      <w:lvlText w:val=""/>
+      <w:lvlJc w:val="left"/>
+      <w:pPr>
+        <w:tabs>
+          <w:tab w:val="num" w:pos="6480"/>
+        </w:tabs>
+        <w:ind w:left="6480" w:hanging="360"/>
+      </w:pPr>
+      <w:rPr>
+        <w:rFonts w:ascii="Wingdings" w:hAnsi="Wingdings" w:hint="default"/>
+        <w:sz w:val="20"/>
+      </w:rPr>
+    </w:lvl>
+  </w:abstractNum>
+  <w:abstractNum w:abstractNumId="4" w15:restartNumberingAfterBreak="0">
+    <w:nsid w:val="64F678E2"/>
+    <w:multiLevelType w:val="multilevel"/>
+    <w:tmpl w:val="87D8FB8A"/>
+    <w:lvl w:ilvl="0">
+      <w:start w:val="1"/>
+      <w:numFmt w:val="bullet"/>
+      <w:lvlText w:val=""/>
+      <w:lvlJc w:val="left"/>
+      <w:pPr>
+        <w:tabs>
+          <w:tab w:val="num" w:pos="720"/>
+        </w:tabs>
+        <w:ind w:left="720" w:hanging="360"/>
+      </w:pPr>
+      <w:rPr>
+        <w:rFonts w:ascii="Symbol" w:hAnsi="Symbol" w:hint="default"/>
+        <w:sz w:val="20"/>
+      </w:rPr>
+    </w:lvl>
+    <w:lvl w:ilvl="1" w:tentative="1">
+      <w:start w:val="1"/>
+      <w:numFmt w:val="bullet"/>
+      <w:lvlText w:val="o"/>
+      <w:lvlJc w:val="left"/>
+      <w:pPr>
+        <w:tabs>
+          <w:tab w:val="num" w:pos="1440"/>
+        </w:tabs>
+        <w:ind w:left="1440" w:hanging="360"/>
+      </w:pPr>
+      <w:rPr>
+        <w:rFonts w:ascii="Courier New" w:hAnsi="Courier New" w:hint="default"/>
+        <w:sz w:val="20"/>
+      </w:rPr>
+    </w:lvl>
+    <w:lvl w:ilvl="2" w:tentative="1">
+      <w:start w:val="1"/>
+      <w:numFmt w:val="bullet"/>
+      <w:lvlText w:val=""/>
+      <w:lvlJc w:val="left"/>
+      <w:pPr>
+        <w:tabs>
+          <w:tab w:val="num" w:pos="2160"/>
+        </w:tabs>
+        <w:ind w:left="2160" w:hanging="360"/>
+      </w:pPr>
+      <w:rPr>
+        <w:rFonts w:ascii="Wingdings" w:hAnsi="Wingdings" w:hint="default"/>
+        <w:sz w:val="20"/>
+      </w:rPr>
+    </w:lvl>
+    <w:lvl w:ilvl="3" w:tentative="1">
+      <w:start w:val="1"/>
+      <w:numFmt w:val="bullet"/>
+      <w:lvlText w:val=""/>
+      <w:lvlJc w:val="left"/>
+      <w:pPr>
+        <w:tabs>
+          <w:tab w:val="num" w:pos="2880"/>
+        </w:tabs>
+        <w:ind w:left="2880" w:hanging="360"/>
+      </w:pPr>
+      <w:rPr>
+        <w:rFonts w:ascii="Wingdings" w:hAnsi="Wingdings" w:hint="default"/>
+        <w:sz w:val="20"/>
+      </w:rPr>
+    </w:lvl>
+    <w:lvl w:ilvl="4" w:tentative="1">
+      <w:start w:val="1"/>
+      <w:numFmt w:val="bullet"/>
+      <w:lvlText w:val=""/>
+      <w:lvlJc w:val="left"/>
+      <w:pPr>
+        <w:tabs>
+          <w:tab w:val="num" w:pos="3600"/>
+        </w:tabs>
+        <w:ind w:left="3600" w:hanging="360"/>
+      </w:pPr>
+      <w:rPr>
+        <w:rFonts w:ascii="Wingdings" w:hAnsi="Wingdings" w:hint="default"/>
+        <w:sz w:val="20"/>
+      </w:rPr>
+    </w:lvl>
+    <w:lvl w:ilvl="5" w:tentative="1">
+      <w:start w:val="1"/>
+      <w:numFmt w:val="bullet"/>
+      <w:lvlText w:val=""/>
+      <w:lvlJc w:val="left"/>
+      <w:pPr>
+        <w:tabs>
+          <w:tab w:val="num" w:pos="4320"/>
+        </w:tabs>
+        <w:ind w:left="4320" w:hanging="360"/>
+      </w:pPr>
+      <w:rPr>
+        <w:rFonts w:ascii="Wingdings" w:hAnsi="Wingdings" w:hint="default"/>
+        <w:sz w:val="20"/>
+      </w:rPr>
+    </w:lvl>
+    <w:lvl w:ilvl="6" w:tentative="1">
+      <w:start w:val="1"/>
+      <w:numFmt w:val="bullet"/>
+      <w:lvlText w:val=""/>
+      <w:lvlJc w:val="left"/>
+      <w:pPr>
+        <w:tabs>
+          <w:tab w:val="num" w:pos="5040"/>
+        </w:tabs>
+        <w:ind w:left="5040" w:hanging="360"/>
+      </w:pPr>
+      <w:rPr>
+        <w:rFonts w:ascii="Wingdings" w:hAnsi="Wingdings" w:hint="default"/>
+        <w:sz w:val="20"/>
+      </w:rPr>
+    </w:lvl>
+    <w:lvl w:ilvl="7" w:tentative="1">
+      <w:start w:val="1"/>
+      <w:numFmt w:val="bullet"/>
+      <w:lvlText w:val=""/>
+      <w:lvlJc w:val="left"/>
+      <w:pPr>
+        <w:tabs>
+          <w:tab w:val="num" w:pos="5760"/>
+        </w:tabs>
+        <w:ind w:left="5760" w:hanging="360"/>
+      </w:pPr>
+      <w:rPr>
+        <w:rFonts w:ascii="Wingdings" w:hAnsi="Wingdings" w:hint="default"/>
+        <w:sz w:val="20"/>
+      </w:rPr>
+    </w:lvl>
+    <w:lvl w:ilvl="8" w:tentative="1">
+      <w:start w:val="1"/>
+      <w:numFmt w:val="bullet"/>
+      <w:lvlText w:val=""/>
+      <w:lvlJc w:val="left"/>
+      <w:pPr>
+        <w:tabs>
+          <w:tab w:val="num" w:pos="6480"/>
+        </w:tabs>
+        <w:ind w:left="6480" w:hanging="360"/>
+      </w:pPr>
+      <w:rPr>
+        <w:rFonts w:ascii="Wingdings" w:hAnsi="Wingdings" w:hint="default"/>
+        <w:sz w:val="20"/>
+      </w:rPr>
+    </w:lvl>
+  </w:abstractNum>
   <w:num w:numId="1" w16cid:durableId="1593665864">
+    <w:abstractNumId w:val="2"/>
+  </w:num>
+  <w:num w:numId="2" w16cid:durableId="1928612143">
+    <w:abstractNumId w:val="1"/>
+  </w:num>
+  <w:num w:numId="3" w16cid:durableId="1081484169">
+    <w:abstractNumId w:val="3"/>
+  </w:num>
+  <w:num w:numId="4" w16cid:durableId="1308851168">
+    <w:abstractNumId w:val="4"/>
+  </w:num>
+  <w:num w:numId="5" w16cid:durableId="901674530">
     <w:abstractNumId w:val="0"/>
   </w:num>
 </w:numbering>
@@ -8553,6 +7028,29 @@
     <w:basedOn w:val="DefaultParagraphFont"/>
     <w:rsid w:val="000442FE"/>
   </w:style>
+  <w:style w:type="character" w:styleId="Hyperlink">
+    <w:name w:val="Hyperlink"/>
+    <w:basedOn w:val="DefaultParagraphFont"/>
+    <w:uiPriority w:val="99"/>
+    <w:unhideWhenUsed/>
+    <w:rsid w:val="00AE06C5"/>
+    <w:rPr>
+      <w:color w:val="0563C1" w:themeColor="hyperlink"/>
+      <w:u w:val="single"/>
+    </w:rPr>
+  </w:style>
+  <w:style w:type="character" w:styleId="UnresolvedMention">
+    <w:name w:val="Unresolved Mention"/>
+    <w:basedOn w:val="DefaultParagraphFont"/>
+    <w:uiPriority w:val="99"/>
+    <w:semiHidden/>
+    <w:unhideWhenUsed/>
+    <w:rsid w:val="00AE06C5"/>
+    <w:rPr>
+      <w:color w:val="605E5C"/>
+      <w:shd w:val="clear" w:color="auto" w:fill="E1DFDD"/>
+    </w:rPr>
+  </w:style>
 </w:styles>
 </file>
 

</xml_diff>

<commit_message>
update to the cv
</commit_message>
<xml_diff>
--- a/CV/CV Maikel Boezer.docx
+++ b/CV/CV Maikel Boezer.docx
@@ -731,6 +731,7 @@
               <w:rPr>
                 <w:rFonts w:ascii="Arial" w:hAnsi="Arial"/>
                 <w:b/>
+                <w:noProof/>
                 <w:sz w:val="32"/>
                 <w:szCs w:val="32"/>
                 <w:lang w:val="nl-NL"/>
@@ -5180,6 +5181,17 @@
         </w:rPr>
         <w:t>Documented findings and limitations to guide adoption as the toolkit's standard deployment process going forward</w:t>
       </w:r>
+      <w:r>
+        <w:rPr>
+          <w:rFonts w:ascii="Times New Roman" w:eastAsia="Times New Roman" w:hAnsi="Times New Roman" w:cs="Times New Roman"/>
+          <w:kern w:val="0"/>
+          <w:sz w:val="24"/>
+          <w:szCs w:val="24"/>
+          <w:lang w:eastAsia="en-GB"/>
+          <w14:ligatures w14:val="none"/>
+        </w:rPr>
+        <w:br/>
+      </w:r>
     </w:p>
     <w:p>
       <w:pPr>
@@ -5321,6 +5333,19 @@
     </w:p>
     <w:p>
       <w:pPr>
+        <w:spacing w:before="100" w:beforeAutospacing="1" w:after="100" w:afterAutospacing="1" w:line="240" w:lineRule="auto"/>
+        <w:rPr>
+          <w:rFonts w:ascii="Times New Roman" w:eastAsia="Times New Roman" w:hAnsi="Times New Roman" w:cs="Times New Roman"/>
+          <w:kern w:val="0"/>
+          <w:sz w:val="24"/>
+          <w:szCs w:val="24"/>
+          <w:lang w:eastAsia="en-GB"/>
+          <w14:ligatures w14:val="none"/>
+        </w:rPr>
+      </w:pPr>
+    </w:p>
+    <w:p>
+      <w:pPr>
         <w:numPr>
           <w:ilvl w:val="0"/>
           <w:numId w:val="3"/>
@@ -5344,6 +5369,7 @@
           <w:lang w:eastAsia="en-GB"/>
           <w14:ligatures w14:val="none"/>
         </w:rPr>
+        <w:lastRenderedPageBreak/>
         <w:t>Deployed the solution as a standalone executable integrated with SharePoint, enabling non-technical supervisors to refresh data without manual intervention</w:t>
       </w:r>
     </w:p>
@@ -5378,6 +5404,20 @@
     <w:p>
       <w:pPr>
         <w:spacing w:before="100" w:beforeAutospacing="1" w:after="100" w:afterAutospacing="1" w:line="240" w:lineRule="auto"/>
+        <w:ind w:left="720"/>
+        <w:rPr>
+          <w:rFonts w:ascii="Times New Roman" w:eastAsia="Times New Roman" w:hAnsi="Times New Roman" w:cs="Times New Roman"/>
+          <w:kern w:val="0"/>
+          <w:sz w:val="24"/>
+          <w:szCs w:val="24"/>
+          <w:lang w:eastAsia="en-GB"/>
+          <w14:ligatures w14:val="none"/>
+        </w:rPr>
+      </w:pPr>
+    </w:p>
+    <w:p>
+      <w:pPr>
+        <w:spacing w:before="100" w:beforeAutospacing="1" w:after="100" w:afterAutospacing="1" w:line="240" w:lineRule="auto"/>
         <w:rPr>
           <w:rFonts w:ascii="Times New Roman" w:eastAsia="Times New Roman" w:hAnsi="Times New Roman" w:cs="Times New Roman"/>
           <w:kern w:val="0"/>
@@ -5398,7 +5438,6 @@
           <w:lang w:eastAsia="en-GB"/>
           <w14:ligatures w14:val="none"/>
         </w:rPr>
-        <w:lastRenderedPageBreak/>
         <w:t>Data Engineer &amp; Analytics Translator — The Hive, Breda Guardians (BUas) (2024)</w:t>
       </w:r>
     </w:p>
@@ -5541,6 +5580,20 @@
         </w:rPr>
         <w:t>Scoped the project's original "AI coach" ambition down to a realistic, reusable foundation, enabling subsequent cohorts to build analytics directly on top of the pipeline</w:t>
       </w:r>
+    </w:p>
+    <w:p>
+      <w:pPr>
+        <w:spacing w:before="100" w:beforeAutospacing="1" w:after="100" w:afterAutospacing="1" w:line="240" w:lineRule="auto"/>
+        <w:ind w:left="720"/>
+        <w:rPr>
+          <w:rFonts w:ascii="Times New Roman" w:eastAsia="Times New Roman" w:hAnsi="Times New Roman" w:cs="Times New Roman"/>
+          <w:kern w:val="0"/>
+          <w:sz w:val="24"/>
+          <w:szCs w:val="24"/>
+          <w:lang w:eastAsia="en-GB"/>
+          <w14:ligatures w14:val="none"/>
+        </w:rPr>
+      </w:pPr>
     </w:p>
     <w:p>
       <w:pPr>

</xml_diff>